<commit_message>
Add configuration management and environment setup
</commit_message>
<xml_diff>
--- a/Agentic Pharma Intelligence Platform.docx
+++ b/Agentic Pharma Intelligence Platform.docx
@@ -994,90 +994,7 @@
                                 <w:sz w:val="20"/>
                                 <w:szCs w:val="20"/>
                               </w:rPr>
-                              <w:t>(</w:t>
-                            </w:r>
-                            <w:r>
-                              <w:rPr>
-                                <w:i/>
-                                <w:iCs/>
-                                <w:sz w:val="20"/>
-                                <w:szCs w:val="20"/>
-                              </w:rPr>
-                              <w:t>ClinicalTrials.gov</w:t>
-                            </w:r>
-                            <w:r>
-                              <w:rPr>
-                                <w:i/>
-                                <w:iCs/>
-                                <w:sz w:val="20"/>
-                                <w:szCs w:val="20"/>
-                              </w:rPr>
-                              <w:t>/</w:t>
-                            </w:r>
-                            <w:r>
-                              <w:rPr>
-                                <w:i/>
-                                <w:iCs/>
-                                <w:sz w:val="20"/>
-                                <w:szCs w:val="20"/>
-                              </w:rPr>
-                              <w:t>PubMed</w:t>
-                            </w:r>
-                            <w:r>
-                              <w:rPr>
-                                <w:i/>
-                                <w:iCs/>
-                                <w:sz w:val="20"/>
-                                <w:szCs w:val="20"/>
-                              </w:rPr>
-                              <w:t>/</w:t>
-                            </w:r>
-                            <w:proofErr w:type="spellStart"/>
-                            <w:r>
-                              <w:rPr>
-                                <w:i/>
-                                <w:iCs/>
-                                <w:sz w:val="20"/>
-                                <w:szCs w:val="20"/>
-                              </w:rPr>
-                              <w:t>OpenFDA</w:t>
-                            </w:r>
-                            <w:proofErr w:type="spellEnd"/>
-                            <w:r>
-                              <w:rPr>
-                                <w:i/>
-                                <w:iCs/>
-                                <w:sz w:val="20"/>
-                                <w:szCs w:val="20"/>
-                              </w:rPr>
-                              <w:t xml:space="preserve"> </w:t>
-                            </w:r>
-                            <w:r>
-                              <w:rPr>
-                                <w:i/>
-                                <w:iCs/>
-                                <w:sz w:val="20"/>
-                                <w:szCs w:val="20"/>
-                              </w:rPr>
-                              <w:t>/</w:t>
-                            </w:r>
-                            <w:r>
-                              <w:rPr>
-                                <w:i/>
-                                <w:iCs/>
-                                <w:sz w:val="20"/>
-                                <w:szCs w:val="20"/>
-                              </w:rPr>
-                              <w:t>Pharma Company RSS / Press Releases</w:t>
-                            </w:r>
-                            <w:r>
-                              <w:rPr>
-                                <w:i/>
-                                <w:iCs/>
-                                <w:sz w:val="20"/>
-                                <w:szCs w:val="20"/>
-                              </w:rPr>
-                              <w:t>)</w:t>
+                              <w:t>(ClinicalTrials.gov/PubMed/OpenFDA /Pharma Company RSS / Press Releases)</w:t>
                             </w:r>
                           </w:p>
                           <w:p>
@@ -1183,90 +1100,7 @@
                           <w:sz w:val="20"/>
                           <w:szCs w:val="20"/>
                         </w:rPr>
-                        <w:t>(</w:t>
-                      </w:r>
-                      <w:r>
-                        <w:rPr>
-                          <w:i/>
-                          <w:iCs/>
-                          <w:sz w:val="20"/>
-                          <w:szCs w:val="20"/>
-                        </w:rPr>
-                        <w:t>ClinicalTrials.gov</w:t>
-                      </w:r>
-                      <w:r>
-                        <w:rPr>
-                          <w:i/>
-                          <w:iCs/>
-                          <w:sz w:val="20"/>
-                          <w:szCs w:val="20"/>
-                        </w:rPr>
-                        <w:t>/</w:t>
-                      </w:r>
-                      <w:r>
-                        <w:rPr>
-                          <w:i/>
-                          <w:iCs/>
-                          <w:sz w:val="20"/>
-                          <w:szCs w:val="20"/>
-                        </w:rPr>
-                        <w:t>PubMed</w:t>
-                      </w:r>
-                      <w:r>
-                        <w:rPr>
-                          <w:i/>
-                          <w:iCs/>
-                          <w:sz w:val="20"/>
-                          <w:szCs w:val="20"/>
-                        </w:rPr>
-                        <w:t>/</w:t>
-                      </w:r>
-                      <w:proofErr w:type="spellStart"/>
-                      <w:r>
-                        <w:rPr>
-                          <w:i/>
-                          <w:iCs/>
-                          <w:sz w:val="20"/>
-                          <w:szCs w:val="20"/>
-                        </w:rPr>
-                        <w:t>OpenFDA</w:t>
-                      </w:r>
-                      <w:proofErr w:type="spellEnd"/>
-                      <w:r>
-                        <w:rPr>
-                          <w:i/>
-                          <w:iCs/>
-                          <w:sz w:val="20"/>
-                          <w:szCs w:val="20"/>
-                        </w:rPr>
-                        <w:t xml:space="preserve"> </w:t>
-                      </w:r>
-                      <w:r>
-                        <w:rPr>
-                          <w:i/>
-                          <w:iCs/>
-                          <w:sz w:val="20"/>
-                          <w:szCs w:val="20"/>
-                        </w:rPr>
-                        <w:t>/</w:t>
-                      </w:r>
-                      <w:r>
-                        <w:rPr>
-                          <w:i/>
-                          <w:iCs/>
-                          <w:sz w:val="20"/>
-                          <w:szCs w:val="20"/>
-                        </w:rPr>
-                        <w:t>Pharma Company RSS / Press Releases</w:t>
-                      </w:r>
-                      <w:r>
-                        <w:rPr>
-                          <w:i/>
-                          <w:iCs/>
-                          <w:sz w:val="20"/>
-                          <w:szCs w:val="20"/>
-                        </w:rPr>
-                        <w:t>)</w:t>
+                        <w:t>(ClinicalTrials.gov/PubMed/OpenFDA /Pharma Company RSS / Press Releases)</w:t>
                       </w:r>
                     </w:p>
                     <w:p>
@@ -2765,7 +2599,6 @@
                                 <w:bCs/>
                               </w:rPr>
                             </w:pPr>
-                            <w:proofErr w:type="gramStart"/>
                             <w:r>
                               <w:rPr>
                                 <w:rFonts w:ascii="Segoe UI" w:eastAsia="Times New Roman" w:hAnsi="Segoe UI" w:cs="Segoe UI"/>
@@ -2776,20 +2609,7 @@
                                 <w:szCs w:val="17"/>
                                 <w14:ligatures w14:val="none"/>
                               </w:rPr>
-                              <w:t>Supervisor</w:t>
-                            </w:r>
-                            <w:proofErr w:type="gramEnd"/>
-                            <w:r>
-                              <w:rPr>
-                                <w:rFonts w:ascii="Segoe UI" w:eastAsia="Times New Roman" w:hAnsi="Segoe UI" w:cs="Segoe UI"/>
-                                <w:b/>
-                                <w:bCs/>
-                                <w:kern w:val="0"/>
-                                <w:sz w:val="17"/>
-                                <w:szCs w:val="17"/>
-                                <w14:ligatures w14:val="none"/>
-                              </w:rPr>
-                              <w:t xml:space="preserve"> Agent</w:t>
+                              <w:t>Supervisor Agent</w:t>
                             </w:r>
                           </w:p>
                         </w:txbxContent>
@@ -2825,7 +2645,6 @@
                           <w:bCs/>
                         </w:rPr>
                       </w:pPr>
-                      <w:proofErr w:type="gramStart"/>
                       <w:r>
                         <w:rPr>
                           <w:rFonts w:ascii="Segoe UI" w:eastAsia="Times New Roman" w:hAnsi="Segoe UI" w:cs="Segoe UI"/>
@@ -2836,20 +2655,7 @@
                           <w:szCs w:val="17"/>
                           <w14:ligatures w14:val="none"/>
                         </w:rPr>
-                        <w:t>Supervisor</w:t>
-                      </w:r>
-                      <w:proofErr w:type="gramEnd"/>
-                      <w:r>
-                        <w:rPr>
-                          <w:rFonts w:ascii="Segoe UI" w:eastAsia="Times New Roman" w:hAnsi="Segoe UI" w:cs="Segoe UI"/>
-                          <w:b/>
-                          <w:bCs/>
-                          <w:kern w:val="0"/>
-                          <w:sz w:val="17"/>
-                          <w:szCs w:val="17"/>
-                          <w14:ligatures w14:val="none"/>
-                        </w:rPr>
-                        <w:t xml:space="preserve"> Agent</w:t>
+                        <w:t>Supervisor Agent</w:t>
                       </w:r>
                     </w:p>
                   </w:txbxContent>
@@ -4178,19 +3984,7 @@
                                 <w:szCs w:val="17"/>
                                 <w14:ligatures w14:val="none"/>
                               </w:rPr>
-                              <w:t>Executive Summary</w:t>
-                            </w:r>
-                            <w:r>
-                              <w:rPr>
-                                <w:rFonts w:ascii="Segoe UI" w:eastAsia="Times New Roman" w:hAnsi="Segoe UI" w:cs="Segoe UI"/>
-                                <w:b/>
-                                <w:bCs/>
-                                <w:kern w:val="0"/>
-                                <w:sz w:val="17"/>
-                                <w:szCs w:val="17"/>
-                                <w14:ligatures w14:val="none"/>
-                              </w:rPr>
-                              <w:t xml:space="preserve"> Agent</w:t>
+                              <w:t>Executive Summary Agent</w:t>
                             </w:r>
                           </w:p>
                         </w:txbxContent>
@@ -4236,19 +4030,7 @@
                           <w:szCs w:val="17"/>
                           <w14:ligatures w14:val="none"/>
                         </w:rPr>
-                        <w:t>Executive Summary</w:t>
-                      </w:r>
-                      <w:r>
-                        <w:rPr>
-                          <w:rFonts w:ascii="Segoe UI" w:eastAsia="Times New Roman" w:hAnsi="Segoe UI" w:cs="Segoe UI"/>
-                          <w:b/>
-                          <w:bCs/>
-                          <w:kern w:val="0"/>
-                          <w:sz w:val="17"/>
-                          <w:szCs w:val="17"/>
-                          <w14:ligatures w14:val="none"/>
-                        </w:rPr>
-                        <w:t xml:space="preserve"> Agent</w:t>
+                        <w:t>Executive Summary Agent</w:t>
                       </w:r>
                     </w:p>
                   </w:txbxContent>
@@ -4530,13 +4312,8 @@
             <w:pPr>
               <w:pStyle w:val="ListParagraph"/>
             </w:pPr>
-            <w:proofErr w:type="gramStart"/>
-            <w:r>
-              <w:t>Models :</w:t>
-            </w:r>
-            <w:proofErr w:type="gramEnd"/>
-            <w:r>
-              <w:t xml:space="preserve"> </w:t>
+            <w:r>
+              <w:t xml:space="preserve">Models : </w:t>
             </w:r>
           </w:p>
           <w:p>
@@ -4831,6 +4608,7 @@
                 <w14:ligatures w14:val="none"/>
               </w:rPr>
             </w:pPr>
+            <w:proofErr w:type="spellStart"/>
             <w:r>
               <w:rPr>
                 <w:rFonts w:ascii="Segoe UI" w:eastAsia="Times New Roman" w:hAnsi="Segoe UI" w:cs="Segoe UI"/>
@@ -4851,6 +4629,7 @@
               </w:rPr>
               <w:t>t</w:t>
             </w:r>
+            <w:proofErr w:type="spellEnd"/>
           </w:p>
           <w:p/>
         </w:tc>
@@ -4983,11 +4762,9 @@
           <w:numId w:val="10"/>
         </w:numPr>
       </w:pPr>
-      <w:proofErr w:type="gramStart"/>
       <w:r>
         <w:t>.env</w:t>
       </w:r>
-      <w:proofErr w:type="gramEnd"/>
     </w:p>
     <w:p>
       <w:pPr>
@@ -5129,8 +4906,13 @@
           <w:numId w:val="10"/>
         </w:numPr>
       </w:pPr>
-      <w:r>
-        <w:t>vectorstore/</w:t>
+      <w:proofErr w:type="spellStart"/>
+      <w:r>
+        <w:t>vectorstore</w:t>
+      </w:r>
+      <w:proofErr w:type="spellEnd"/>
+      <w:r>
+        <w:t>/</w:t>
       </w:r>
     </w:p>
     <w:p>
@@ -5633,17 +5415,7 @@
                 <w:szCs w:val="21"/>
                 <w14:ligatures w14:val="none"/>
               </w:rPr>
-              <w:t>Summarizing</w:t>
-            </w:r>
-            <w:r>
-              <w:rPr>
-                <w:rFonts w:ascii="Segoe UI" w:eastAsia="Times New Roman" w:hAnsi="Segoe UI" w:cs="Segoe UI"/>
-                <w:kern w:val="0"/>
-                <w:sz w:val="21"/>
-                <w:szCs w:val="21"/>
-                <w14:ligatures w14:val="none"/>
-              </w:rPr>
-              <w:t xml:space="preserve"> updates</w:t>
+              <w:t>Summarizing updates</w:t>
             </w:r>
           </w:p>
           <w:p>
@@ -6426,27 +6198,7 @@
                 <w:szCs w:val="21"/>
                 <w14:ligatures w14:val="none"/>
               </w:rPr>
-              <w:t>FDA approved</w:t>
-            </w:r>
-            <w:r>
-              <w:rPr>
-                <w:rFonts w:ascii="Segoe UI" w:eastAsia="Times New Roman" w:hAnsi="Segoe UI" w:cs="Segoe UI"/>
-                <w:kern w:val="0"/>
-                <w:sz w:val="21"/>
-                <w:szCs w:val="21"/>
-                <w14:ligatures w14:val="none"/>
-              </w:rPr>
-              <w:t xml:space="preserve"> </w:t>
-            </w:r>
-            <w:r>
-              <w:rPr>
-                <w:rFonts w:ascii="Segoe UI" w:eastAsia="Times New Roman" w:hAnsi="Segoe UI" w:cs="Segoe UI"/>
-                <w:kern w:val="0"/>
-                <w:sz w:val="21"/>
-                <w:szCs w:val="21"/>
-                <w14:ligatures w14:val="none"/>
-              </w:rPr>
-              <w:t>new indication for Drug X</w:t>
+              <w:t>FDA approved new indication for Drug X</w:t>
             </w:r>
           </w:p>
           <w:p>
@@ -6545,20 +6297,7 @@
                 <w:szCs w:val="21"/>
                 <w14:ligatures w14:val="none"/>
               </w:rPr>
-              <w:t>RSS feeds/Investor relations pages/Company newsrooms</w:t>
-            </w:r>
-            <w:r>
-              <w:rPr>
-                <w:rFonts w:ascii="Segoe UI" w:eastAsia="Times New Roman" w:hAnsi="Segoe UI" w:cs="Segoe UI"/>
-                <w:i/>
-                <w:iCs/>
-                <w:color w:val="FF0000"/>
-                <w:kern w:val="0"/>
-                <w:sz w:val="21"/>
-                <w:szCs w:val="21"/>
-                <w14:ligatures w14:val="none"/>
-              </w:rPr>
-              <w:t>)</w:t>
+              <w:t>RSS feeds/Investor relations pages/Company newsrooms)</w:t>
             </w:r>
           </w:p>
         </w:tc>
@@ -7000,17 +6739,7 @@
                 <w:szCs w:val="21"/>
                 <w14:ligatures w14:val="none"/>
               </w:rPr>
-              <w:t>in obesity drugs</w:t>
-            </w:r>
-            <w:r>
-              <w:rPr>
-                <w:rFonts w:ascii="Segoe UI" w:eastAsia="Times New Roman" w:hAnsi="Segoe UI" w:cs="Segoe UI"/>
-                <w:kern w:val="0"/>
-                <w:sz w:val="21"/>
-                <w:szCs w:val="21"/>
-                <w14:ligatures w14:val="none"/>
-              </w:rPr>
-              <w:t>?</w:t>
+              <w:t>in obesity drugs?</w:t>
             </w:r>
           </w:p>
         </w:tc>
@@ -7073,10 +6802,7 @@
               <w:cnfStyle w:val="100000000000" w:firstRow="1" w:lastRow="0" w:firstColumn="0" w:lastColumn="0" w:oddVBand="0" w:evenVBand="0" w:oddHBand="0" w:evenHBand="0" w:firstRowFirstColumn="0" w:firstRowLastColumn="0" w:lastRowFirstColumn="0" w:lastRowLastColumn="0"/>
             </w:pPr>
             <w:r>
-              <w:t>Sources/</w:t>
-            </w:r>
-            <w:r>
-              <w:t>Input</w:t>
+              <w:t>Sources/Input</w:t>
             </w:r>
           </w:p>
         </w:tc>
@@ -8150,9 +7876,8 @@
           <w:szCs w:val="21"/>
           <w14:ligatures w14:val="none"/>
         </w:rPr>
-        <w:t xml:space="preserve">Store raw source </w:t>
-      </w:r>
-      <w:proofErr w:type="gramStart"/>
+        <w:t>Store raw source documents</w:t>
+      </w:r>
       <w:r>
         <w:rPr>
           <w:rFonts w:ascii="Segoe UI" w:eastAsia="Times New Roman" w:hAnsi="Segoe UI" w:cs="Segoe UI"/>
@@ -8161,19 +7886,8 @@
           <w:szCs w:val="21"/>
           <w14:ligatures w14:val="none"/>
         </w:rPr>
-        <w:t>documents</w:t>
-      </w:r>
-      <w:r>
-        <w:rPr>
-          <w:rFonts w:ascii="Segoe UI" w:eastAsia="Times New Roman" w:hAnsi="Segoe UI" w:cs="Segoe UI"/>
-          <w:kern w:val="0"/>
-          <w:sz w:val="21"/>
-          <w:szCs w:val="21"/>
-          <w14:ligatures w14:val="none"/>
-        </w:rPr>
         <w:t>(</w:t>
       </w:r>
-      <w:proofErr w:type="gramEnd"/>
       <w:r>
         <w:rPr>
           <w:rFonts w:ascii="Segoe UI" w:eastAsia="Times New Roman" w:hAnsi="Segoe UI" w:cs="Segoe UI"/>
@@ -8311,7 +8025,6 @@
         <w:t>/</w:t>
       </w:r>
       <w:proofErr w:type="spellStart"/>
-      <w:proofErr w:type="gramStart"/>
       <w:r>
         <w:rPr>
           <w:rFonts w:ascii="Segoe UI" w:eastAsia="Times New Roman" w:hAnsi="Segoe UI" w:cs="Segoe UI"/>
@@ -8320,18 +8033,7 @@
           <w:szCs w:val="21"/>
           <w14:ligatures w14:val="none"/>
         </w:rPr>
-        <w:t>clinical</w:t>
-      </w:r>
-      <w:proofErr w:type="gramEnd"/>
-      <w:r>
-        <w:rPr>
-          <w:rFonts w:ascii="Segoe UI" w:eastAsia="Times New Roman" w:hAnsi="Segoe UI" w:cs="Segoe UI"/>
-          <w:kern w:val="0"/>
-          <w:sz w:val="21"/>
-          <w:szCs w:val="21"/>
-          <w14:ligatures w14:val="none"/>
-        </w:rPr>
-        <w:t>_trials</w:t>
+        <w:t>clinical_trials</w:t>
       </w:r>
       <w:proofErr w:type="spellEnd"/>
       <w:r>
@@ -8421,7 +8123,6 @@
         <w:t>/</w:t>
       </w:r>
       <w:proofErr w:type="spellStart"/>
-      <w:proofErr w:type="gramStart"/>
       <w:r>
         <w:rPr>
           <w:rFonts w:ascii="Segoe UI" w:eastAsia="Times New Roman" w:hAnsi="Segoe UI" w:cs="Segoe UI"/>
@@ -8430,18 +8131,7 @@
           <w:szCs w:val="21"/>
           <w14:ligatures w14:val="none"/>
         </w:rPr>
-        <w:t>press</w:t>
-      </w:r>
-      <w:proofErr w:type="gramEnd"/>
-      <w:r>
-        <w:rPr>
-          <w:rFonts w:ascii="Segoe UI" w:eastAsia="Times New Roman" w:hAnsi="Segoe UI" w:cs="Segoe UI"/>
-          <w:kern w:val="0"/>
-          <w:sz w:val="21"/>
-          <w:szCs w:val="21"/>
-          <w14:ligatures w14:val="none"/>
-        </w:rPr>
-        <w:t>_releases</w:t>
+        <w:t>press_releases</w:t>
       </w:r>
       <w:proofErr w:type="spellEnd"/>
       <w:r>
@@ -8600,7 +8290,6 @@
         </w:rPr>
       </w:pPr>
       <w:proofErr w:type="spellStart"/>
-      <w:proofErr w:type="gramStart"/>
       <w:r>
         <w:rPr>
           <w:rFonts w:ascii="Segoe UI" w:eastAsia="Times New Roman" w:hAnsi="Segoe UI" w:cs="Segoe UI"/>
@@ -8612,7 +8301,6 @@
         <w:t>RegulatoryEvent</w:t>
       </w:r>
       <w:proofErr w:type="spellEnd"/>
-      <w:proofErr w:type="gramEnd"/>
     </w:p>
     <w:p>
       <w:pPr>
@@ -9019,17 +8707,1662 @@
     </w:p>
     <w:p>
       <w:pPr>
+        <w:pStyle w:val="Heading1"/>
+      </w:pPr>
+      <w:r>
+        <w:t>Phase 1</w:t>
+      </w:r>
+    </w:p>
+    <w:p>
+      <w:pPr>
+        <w:pBdr>
+          <w:top w:val="single" w:sz="4" w:space="1" w:color="auto"/>
+          <w:left w:val="single" w:sz="4" w:space="4" w:color="auto"/>
+          <w:bottom w:val="single" w:sz="4" w:space="1" w:color="auto"/>
+          <w:right w:val="single" w:sz="4" w:space="0" w:color="auto"/>
+        </w:pBdr>
         <w:rPr>
           <w:color w:val="FF0000"/>
         </w:rPr>
       </w:pPr>
+      <w:r>
+        <w:rPr>
+          <w:color w:val="FF0000"/>
+        </w:rPr>
+        <w:t>Azure Function</w:t>
+      </w:r>
+    </w:p>
+    <w:p>
+      <w:pPr>
+        <w:pBdr>
+          <w:top w:val="single" w:sz="4" w:space="1" w:color="auto"/>
+          <w:left w:val="single" w:sz="4" w:space="4" w:color="auto"/>
+          <w:bottom w:val="single" w:sz="4" w:space="1" w:color="auto"/>
+          <w:right w:val="single" w:sz="4" w:space="0" w:color="auto"/>
+        </w:pBdr>
+        <w:ind w:firstLine="720"/>
+        <w:rPr>
+          <w:color w:val="FF0000"/>
+        </w:rPr>
+      </w:pPr>
+      <w:r>
+        <w:rPr>
+          <w:color w:val="FF0000"/>
+        </w:rPr>
+        <w:t>↓</w:t>
+      </w:r>
+    </w:p>
+    <w:p>
+      <w:pPr>
+        <w:pBdr>
+          <w:top w:val="single" w:sz="4" w:space="1" w:color="auto"/>
+          <w:left w:val="single" w:sz="4" w:space="4" w:color="auto"/>
+          <w:bottom w:val="single" w:sz="4" w:space="1" w:color="auto"/>
+          <w:right w:val="single" w:sz="4" w:space="0" w:color="auto"/>
+        </w:pBdr>
+        <w:rPr>
+          <w:color w:val="FF0000"/>
+        </w:rPr>
+      </w:pPr>
+      <w:r>
+        <w:rPr>
+          <w:color w:val="FF0000"/>
+        </w:rPr>
+        <w:t>ClinicalTrials.gov</w:t>
+      </w:r>
+      <w:r>
+        <w:rPr>
+          <w:color w:val="FF0000"/>
+        </w:rPr>
+        <w:t xml:space="preserve"> API</w:t>
+      </w:r>
+    </w:p>
+    <w:p>
+      <w:pPr>
+        <w:pBdr>
+          <w:top w:val="single" w:sz="4" w:space="1" w:color="auto"/>
+          <w:left w:val="single" w:sz="4" w:space="4" w:color="auto"/>
+          <w:bottom w:val="single" w:sz="4" w:space="1" w:color="auto"/>
+          <w:right w:val="single" w:sz="4" w:space="0" w:color="auto"/>
+        </w:pBdr>
+        <w:ind w:firstLine="720"/>
+        <w:rPr>
+          <w:color w:val="FF0000"/>
+        </w:rPr>
+      </w:pPr>
+      <w:r>
+        <w:rPr>
+          <w:color w:val="FF0000"/>
+        </w:rPr>
+        <w:t>↓</w:t>
+      </w:r>
+    </w:p>
+    <w:p>
+      <w:pPr>
+        <w:pBdr>
+          <w:top w:val="single" w:sz="4" w:space="1" w:color="auto"/>
+          <w:left w:val="single" w:sz="4" w:space="4" w:color="auto"/>
+          <w:bottom w:val="single" w:sz="4" w:space="1" w:color="auto"/>
+          <w:right w:val="single" w:sz="4" w:space="0" w:color="auto"/>
+        </w:pBdr>
+        <w:rPr>
+          <w:color w:val="FF0000"/>
+        </w:rPr>
+      </w:pPr>
+      <w:r>
+        <w:rPr>
+          <w:color w:val="FF0000"/>
+        </w:rPr>
+        <w:t>Raw JSON</w:t>
+      </w:r>
+    </w:p>
+    <w:p>
+      <w:pPr>
+        <w:pBdr>
+          <w:top w:val="single" w:sz="4" w:space="1" w:color="auto"/>
+          <w:left w:val="single" w:sz="4" w:space="4" w:color="auto"/>
+          <w:bottom w:val="single" w:sz="4" w:space="1" w:color="auto"/>
+          <w:right w:val="single" w:sz="4" w:space="0" w:color="auto"/>
+        </w:pBdr>
+        <w:ind w:firstLine="720"/>
+        <w:rPr>
+          <w:color w:val="FF0000"/>
+        </w:rPr>
+      </w:pPr>
+      <w:r>
+        <w:rPr>
+          <w:color w:val="FF0000"/>
+        </w:rPr>
+        <w:t>↓</w:t>
+      </w:r>
+    </w:p>
+    <w:p>
+      <w:pPr>
+        <w:pBdr>
+          <w:top w:val="single" w:sz="4" w:space="1" w:color="auto"/>
+          <w:left w:val="single" w:sz="4" w:space="4" w:color="auto"/>
+          <w:bottom w:val="single" w:sz="4" w:space="1" w:color="auto"/>
+          <w:right w:val="single" w:sz="4" w:space="0" w:color="auto"/>
+        </w:pBdr>
+        <w:rPr>
+          <w:color w:val="FF0000"/>
+        </w:rPr>
+      </w:pPr>
+      <w:r>
+        <w:rPr>
+          <w:color w:val="FF0000"/>
+        </w:rPr>
+        <w:t>Azure Blob Storage</w:t>
+      </w:r>
+    </w:p>
+    <w:p>
+      <w:pPr>
+        <w:pBdr>
+          <w:top w:val="single" w:sz="4" w:space="1" w:color="auto"/>
+          <w:left w:val="single" w:sz="4" w:space="4" w:color="auto"/>
+          <w:bottom w:val="single" w:sz="4" w:space="1" w:color="auto"/>
+          <w:right w:val="single" w:sz="4" w:space="0" w:color="auto"/>
+        </w:pBdr>
+        <w:ind w:firstLine="720"/>
+        <w:rPr>
+          <w:color w:val="FF0000"/>
+        </w:rPr>
+      </w:pPr>
+      <w:r>
+        <w:rPr>
+          <w:color w:val="FF0000"/>
+        </w:rPr>
+        <w:t>↓</w:t>
+      </w:r>
+    </w:p>
+    <w:p>
+      <w:pPr>
+        <w:pBdr>
+          <w:top w:val="single" w:sz="4" w:space="1" w:color="auto"/>
+          <w:left w:val="single" w:sz="4" w:space="4" w:color="auto"/>
+          <w:bottom w:val="single" w:sz="4" w:space="1" w:color="auto"/>
+          <w:right w:val="single" w:sz="4" w:space="0" w:color="auto"/>
+        </w:pBdr>
+        <w:rPr>
+          <w:color w:val="FF0000"/>
+        </w:rPr>
+      </w:pPr>
+      <w:r>
+        <w:rPr>
+          <w:color w:val="FF0000"/>
+        </w:rPr>
+        <w:t>Azure SQL</w:t>
+      </w:r>
+    </w:p>
+    <w:p>
+      <w:pPr>
+        <w:pBdr>
+          <w:top w:val="single" w:sz="4" w:space="1" w:color="auto"/>
+          <w:left w:val="single" w:sz="4" w:space="4" w:color="auto"/>
+          <w:bottom w:val="single" w:sz="4" w:space="1" w:color="auto"/>
+          <w:right w:val="single" w:sz="4" w:space="0" w:color="auto"/>
+        </w:pBdr>
+        <w:ind w:firstLine="720"/>
+        <w:rPr>
+          <w:color w:val="FF0000"/>
+        </w:rPr>
+      </w:pPr>
+      <w:r>
+        <w:rPr>
+          <w:color w:val="FF0000"/>
+        </w:rPr>
+        <w:t>↓</w:t>
+      </w:r>
+    </w:p>
+    <w:p>
+      <w:pPr>
+        <w:pBdr>
+          <w:top w:val="single" w:sz="4" w:space="1" w:color="auto"/>
+          <w:left w:val="single" w:sz="4" w:space="4" w:color="auto"/>
+          <w:bottom w:val="single" w:sz="4" w:space="1" w:color="auto"/>
+          <w:right w:val="single" w:sz="4" w:space="0" w:color="auto"/>
+        </w:pBdr>
+        <w:rPr>
+          <w:color w:val="FF0000"/>
+        </w:rPr>
+      </w:pPr>
+      <w:r>
+        <w:rPr>
+          <w:color w:val="FF0000"/>
+        </w:rPr>
+        <w:t>FAISS</w:t>
+      </w:r>
+    </w:p>
+    <w:p>
+      <w:pPr>
+        <w:pBdr>
+          <w:top w:val="single" w:sz="4" w:space="1" w:color="auto"/>
+          <w:left w:val="single" w:sz="4" w:space="4" w:color="auto"/>
+          <w:bottom w:val="single" w:sz="4" w:space="1" w:color="auto"/>
+          <w:right w:val="single" w:sz="4" w:space="0" w:color="auto"/>
+        </w:pBdr>
+        <w:ind w:firstLine="720"/>
+        <w:rPr>
+          <w:color w:val="FF0000"/>
+        </w:rPr>
+      </w:pPr>
+      <w:r>
+        <w:rPr>
+          <w:color w:val="FF0000"/>
+        </w:rPr>
+        <w:t>↓</w:t>
+      </w:r>
+    </w:p>
+    <w:p>
+      <w:pPr>
+        <w:pBdr>
+          <w:top w:val="single" w:sz="4" w:space="1" w:color="auto"/>
+          <w:left w:val="single" w:sz="4" w:space="4" w:color="auto"/>
+          <w:bottom w:val="single" w:sz="4" w:space="1" w:color="auto"/>
+          <w:right w:val="single" w:sz="4" w:space="0" w:color="auto"/>
+        </w:pBdr>
+        <w:rPr>
+          <w:color w:val="FF0000"/>
+        </w:rPr>
+      </w:pPr>
+      <w:proofErr w:type="spellStart"/>
+      <w:r>
+        <w:rPr>
+          <w:color w:val="FF0000"/>
+        </w:rPr>
+        <w:t>LangGraph</w:t>
+      </w:r>
+      <w:proofErr w:type="spellEnd"/>
+      <w:r>
+        <w:rPr>
+          <w:color w:val="FF0000"/>
+        </w:rPr>
+        <w:t>.</w:t>
+      </w:r>
+    </w:p>
+    <w:p>
+      <w:pPr>
+        <w:rPr>
+          <w:color w:val="FF0000"/>
+        </w:rPr>
+      </w:pPr>
+    </w:p>
+    <w:p>
+      <w:pPr>
+        <w:rPr>
+          <w:color w:val="FF0000"/>
+        </w:rPr>
+      </w:pPr>
     </w:p>
     <w:p>
       <w:pPr>
         <w:pStyle w:val="Heading1"/>
       </w:pPr>
+    </w:p>
+    <w:p>
+      <w:pPr>
+        <w:pStyle w:val="Heading1"/>
+      </w:pPr>
+    </w:p>
+    <w:p/>
+    <w:p/>
+    <w:p>
+      <w:pPr>
+        <w:pStyle w:val="Heading1"/>
+      </w:pPr>
+      <w:r>
+        <w:lastRenderedPageBreak/>
+        <w:t>Data Ingestion</w:t>
+      </w:r>
+    </w:p>
+    <w:p>
+      <w:pPr>
+        <w:pStyle w:val="ListParagraph"/>
+        <w:numPr>
+          <w:ilvl w:val="0"/>
+          <w:numId w:val="38"/>
+        </w:numPr>
+      </w:pPr>
+      <w:r>
+        <w:t>Create Azure resources</w:t>
+      </w:r>
+    </w:p>
+    <w:tbl>
+      <w:tblPr>
+        <w:tblStyle w:val="TableGrid"/>
+        <w:tblW w:w="0" w:type="auto"/>
+        <w:tblLook w:val="04A0" w:firstRow="1" w:lastRow="0" w:firstColumn="1" w:lastColumn="0" w:noHBand="0" w:noVBand="1"/>
+      </w:tblPr>
+      <w:tblGrid>
+        <w:gridCol w:w="4675"/>
+        <w:gridCol w:w="4675"/>
+      </w:tblGrid>
+      <w:tr>
+        <w:tc>
+          <w:tcPr>
+            <w:tcW w:w="4675" w:type="dxa"/>
+          </w:tcPr>
+          <w:p>
+            <w:pPr>
+              <w:spacing w:after="160" w:line="278" w:lineRule="auto"/>
+            </w:pPr>
+            <w:r>
+              <w:t>Subscription</w:t>
+            </w:r>
+          </w:p>
+        </w:tc>
+        <w:tc>
+          <w:tcPr>
+            <w:tcW w:w="4675" w:type="dxa"/>
+          </w:tcPr>
+          <w:p>
+            <w:pPr>
+              <w:spacing w:after="160" w:line="278" w:lineRule="auto"/>
+            </w:pPr>
+            <w:r>
+              <w:t>Azure subscription 1</w:t>
+            </w:r>
+          </w:p>
+        </w:tc>
+      </w:tr>
+      <w:tr>
+        <w:tc>
+          <w:tcPr>
+            <w:tcW w:w="4675" w:type="dxa"/>
+          </w:tcPr>
+          <w:p>
+            <w:r>
+              <w:t>Resource Group</w:t>
+            </w:r>
+          </w:p>
+        </w:tc>
+        <w:tc>
+          <w:tcPr>
+            <w:tcW w:w="4675" w:type="dxa"/>
+          </w:tcPr>
+          <w:p>
+            <w:pPr>
+              <w:spacing w:after="160" w:line="278" w:lineRule="auto"/>
+            </w:pPr>
+            <w:proofErr w:type="spellStart"/>
+            <w:r>
+              <w:t>rg</w:t>
+            </w:r>
+            <w:proofErr w:type="spellEnd"/>
+            <w:r>
+              <w:t>-pharma-intelligence-dev</w:t>
+            </w:r>
+          </w:p>
+        </w:tc>
+      </w:tr>
+      <w:tr>
+        <w:trPr>
+          <w:trHeight w:val="517"/>
+        </w:trPr>
+        <w:tc>
+          <w:tcPr>
+            <w:tcW w:w="4675" w:type="dxa"/>
+            <w:tcBorders>
+              <w:bottom w:val="single" w:sz="4" w:space="0" w:color="auto"/>
+            </w:tcBorders>
+          </w:tcPr>
+          <w:p>
+            <w:pPr>
+              <w:spacing w:after="160" w:line="278" w:lineRule="auto"/>
+            </w:pPr>
+            <w:r>
+              <w:t>Location</w:t>
+            </w:r>
+          </w:p>
+          <w:p/>
+        </w:tc>
+        <w:tc>
+          <w:tcPr>
+            <w:tcW w:w="4675" w:type="dxa"/>
+            <w:tcBorders>
+              <w:bottom w:val="single" w:sz="4" w:space="0" w:color="auto"/>
+            </w:tcBorders>
+          </w:tcPr>
+          <w:p>
+            <w:pPr>
+              <w:spacing w:after="160" w:line="278" w:lineRule="auto"/>
+            </w:pPr>
+            <w:r>
+              <w:t>East US</w:t>
+            </w:r>
+          </w:p>
+          <w:p/>
+        </w:tc>
+      </w:tr>
+    </w:tbl>
+    <w:p/>
+    <w:p>
+      <w:pPr>
+        <w:pStyle w:val="Subtitle"/>
+      </w:pPr>
+      <w:r>
+        <w:t>Blob Storage</w:t>
+      </w:r>
+    </w:p>
+    <w:p/>
+    <w:tbl>
+      <w:tblPr>
+        <w:tblStyle w:val="TableGrid"/>
+        <w:tblW w:w="0" w:type="auto"/>
+        <w:tblLook w:val="04A0" w:firstRow="1" w:lastRow="0" w:firstColumn="1" w:lastColumn="0" w:noHBand="0" w:noVBand="1"/>
+      </w:tblPr>
+      <w:tblGrid>
+        <w:gridCol w:w="4675"/>
+        <w:gridCol w:w="4675"/>
+      </w:tblGrid>
+      <w:tr>
+        <w:tc>
+          <w:tcPr>
+            <w:tcW w:w="4675" w:type="dxa"/>
+            <w:tcBorders>
+              <w:top w:val="single" w:sz="4" w:space="0" w:color="auto"/>
+              <w:left w:val="single" w:sz="4" w:space="0" w:color="auto"/>
+              <w:right w:val="single" w:sz="4" w:space="0" w:color="auto"/>
+            </w:tcBorders>
+          </w:tcPr>
+          <w:p>
+            <w:pPr>
+              <w:spacing w:after="160" w:line="278" w:lineRule="auto"/>
+            </w:pPr>
+            <w:r>
+              <w:t>Storage account name</w:t>
+            </w:r>
+          </w:p>
+        </w:tc>
+        <w:tc>
+          <w:tcPr>
+            <w:tcW w:w="4675" w:type="dxa"/>
+            <w:tcBorders>
+              <w:top w:val="single" w:sz="4" w:space="0" w:color="auto"/>
+              <w:left w:val="single" w:sz="4" w:space="0" w:color="auto"/>
+              <w:right w:val="single" w:sz="4" w:space="0" w:color="auto"/>
+            </w:tcBorders>
+          </w:tcPr>
+          <w:p>
+            <w:pPr>
+              <w:spacing w:after="160" w:line="278" w:lineRule="auto"/>
+            </w:pPr>
+            <w:proofErr w:type="spellStart"/>
+            <w:r>
+              <w:t>stpharmaintel</w:t>
+            </w:r>
+            <w:proofErr w:type="spellEnd"/>
+          </w:p>
+        </w:tc>
+      </w:tr>
+      <w:tr>
+        <w:tc>
+          <w:tcPr>
+            <w:tcW w:w="4675" w:type="dxa"/>
+            <w:tcBorders>
+              <w:left w:val="single" w:sz="4" w:space="0" w:color="auto"/>
+            </w:tcBorders>
+          </w:tcPr>
+          <w:p>
+            <w:r>
+              <w:t>Services</w:t>
+            </w:r>
+          </w:p>
+          <w:p/>
+        </w:tc>
+        <w:tc>
+          <w:tcPr>
+            <w:tcW w:w="4675" w:type="dxa"/>
+            <w:tcBorders>
+              <w:right w:val="single" w:sz="4" w:space="0" w:color="auto"/>
+            </w:tcBorders>
+          </w:tcPr>
+          <w:p>
+            <w:r>
+              <w:t>Blob Storage</w:t>
+            </w:r>
+          </w:p>
+          <w:p/>
+        </w:tc>
+      </w:tr>
+      <w:tr>
+        <w:tc>
+          <w:tcPr>
+            <w:tcW w:w="4675" w:type="dxa"/>
+            <w:tcBorders>
+              <w:left w:val="single" w:sz="4" w:space="0" w:color="auto"/>
+              <w:bottom w:val="single" w:sz="4" w:space="0" w:color="auto"/>
+              <w:right w:val="single" w:sz="4" w:space="0" w:color="auto"/>
+            </w:tcBorders>
+          </w:tcPr>
+          <w:p>
+            <w:r>
+              <w:t>container</w:t>
+            </w:r>
+          </w:p>
+          <w:p/>
+        </w:tc>
+        <w:tc>
+          <w:tcPr>
+            <w:tcW w:w="4675" w:type="dxa"/>
+            <w:tcBorders>
+              <w:left w:val="single" w:sz="4" w:space="0" w:color="auto"/>
+              <w:bottom w:val="single" w:sz="4" w:space="0" w:color="auto"/>
+              <w:right w:val="single" w:sz="4" w:space="0" w:color="auto"/>
+            </w:tcBorders>
+          </w:tcPr>
+          <w:p>
+            <w:r>
+              <w:t>clinical-trials</w:t>
+            </w:r>
+            <w:r>
+              <w:t xml:space="preserve">, </w:t>
+            </w:r>
+            <w:proofErr w:type="spellStart"/>
+            <w:r>
+              <w:t>pubmed</w:t>
+            </w:r>
+            <w:proofErr w:type="spellEnd"/>
+            <w:r>
+              <w:t xml:space="preserve">, </w:t>
+            </w:r>
+            <w:proofErr w:type="spellStart"/>
+            <w:r>
+              <w:t>fda</w:t>
+            </w:r>
+            <w:proofErr w:type="spellEnd"/>
+            <w:r>
+              <w:t xml:space="preserve"> </w:t>
+            </w:r>
+          </w:p>
+          <w:p/>
+        </w:tc>
+      </w:tr>
+    </w:tbl>
+    <w:p/>
+    <w:p>
+      <w:pPr>
+        <w:rPr>
+          <w:color w:val="FF0000"/>
+        </w:rPr>
+      </w:pPr>
+      <w:r>
+        <w:rPr>
+          <w:color w:val="FF0000"/>
+        </w:rPr>
+        <w:t>Get the Storage Connection String:</w:t>
+      </w:r>
+    </w:p>
+    <w:p>
+      <w:r>
+        <w:t>(</w:t>
+      </w:r>
+      <w:r>
+        <w:t>Access keys authenticate your applications’ requests to this storage account</w:t>
+      </w:r>
+      <w:r>
+        <w:t>)</w:t>
+      </w:r>
+    </w:p>
+    <w:p>
+      <w:pPr>
+        <w:pStyle w:val="ListParagraph"/>
+        <w:numPr>
+          <w:ilvl w:val="0"/>
+          <w:numId w:val="39"/>
+        </w:numPr>
+        <w:rPr>
+          <w:b/>
+          <w:bCs/>
+        </w:rPr>
+      </w:pPr>
+      <w:r>
+        <w:t>Storage account(</w:t>
+      </w:r>
       <w:proofErr w:type="spellStart"/>
       <w:r>
+        <w:rPr>
+          <w:b/>
+          <w:bCs/>
+        </w:rPr>
+        <w:t>stpharmaintel</w:t>
+      </w:r>
+      <w:proofErr w:type="spellEnd"/>
+      <w:r>
+        <w:rPr>
+          <w:b/>
+          <w:bCs/>
+        </w:rPr>
+        <w:t xml:space="preserve">) </w:t>
+      </w:r>
+      <w:r>
+        <w:rPr>
+          <w:b/>
+          <w:bCs/>
+        </w:rPr>
+        <w:sym w:font="Wingdings" w:char="F0E0"/>
+      </w:r>
+      <w:r>
+        <w:rPr>
+          <w:b/>
+          <w:bCs/>
+        </w:rPr>
+        <w:t xml:space="preserve"> </w:t>
+      </w:r>
+      <w:proofErr w:type="spellStart"/>
+      <w:r>
+        <w:rPr>
+          <w:b/>
+          <w:bCs/>
+        </w:rPr>
+        <w:t>Security+networking</w:t>
+      </w:r>
+      <w:proofErr w:type="spellEnd"/>
+      <w:r>
+        <w:rPr>
+          <w:b/>
+          <w:bCs/>
+        </w:rPr>
+        <w:t xml:space="preserve"> </w:t>
+      </w:r>
+      <w:r>
+        <w:rPr>
+          <w:b/>
+          <w:bCs/>
+        </w:rPr>
+        <w:sym w:font="Wingdings" w:char="F0E0"/>
+      </w:r>
+      <w:r>
+        <w:rPr>
+          <w:b/>
+          <w:bCs/>
+        </w:rPr>
+        <w:t xml:space="preserve"> Access keys </w:t>
+      </w:r>
+    </w:p>
+    <w:p>
+      <w:pPr>
+        <w:pStyle w:val="ListParagraph"/>
+      </w:pPr>
+      <w:r>
+        <w:rPr>
+          <w:b/>
+          <w:bCs/>
+        </w:rPr>
+        <w:t xml:space="preserve">Key: </w:t>
+      </w:r>
+      <w:r>
+        <w:t>“ “</w:t>
+      </w:r>
+    </w:p>
+    <w:p>
+      <w:pPr>
+        <w:pStyle w:val="ListParagraph"/>
+        <w:rPr>
+          <w:b/>
+          <w:bCs/>
+        </w:rPr>
+      </w:pPr>
+    </w:p>
+    <w:p>
+      <w:pPr>
+        <w:pStyle w:val="ListParagraph"/>
+      </w:pPr>
+      <w:r>
+        <w:rPr>
+          <w:b/>
+          <w:bCs/>
+        </w:rPr>
+        <w:t xml:space="preserve">Connection string: </w:t>
+      </w:r>
+      <w:r>
+        <w:t>“ “</w:t>
+      </w:r>
+    </w:p>
+    <w:p>
+      <w:pPr>
+        <w:rPr>
+          <w:color w:val="FF0000"/>
+        </w:rPr>
+      </w:pPr>
+      <w:r>
+        <w:rPr>
+          <w:color w:val="FF0000"/>
+        </w:rPr>
+        <w:t>Verify with Python Locally</w:t>
+      </w:r>
+    </w:p>
+    <w:p>
+      <w:pPr>
+        <w:pStyle w:val="ListParagraph"/>
+        <w:numPr>
+          <w:ilvl w:val="0"/>
+          <w:numId w:val="40"/>
+        </w:numPr>
+      </w:pPr>
+      <w:proofErr w:type="spellStart"/>
+      <w:r>
+        <w:t>uv</w:t>
+      </w:r>
+      <w:proofErr w:type="spellEnd"/>
+      <w:r>
+        <w:t xml:space="preserve"> add azure-functions</w:t>
+      </w:r>
+    </w:p>
+    <w:p>
+      <w:pPr>
+        <w:pStyle w:val="ListParagraph"/>
+        <w:numPr>
+          <w:ilvl w:val="0"/>
+          <w:numId w:val="40"/>
+        </w:numPr>
+      </w:pPr>
+      <w:proofErr w:type="spellStart"/>
+      <w:r>
+        <w:t>uv</w:t>
+      </w:r>
+      <w:proofErr w:type="spellEnd"/>
+      <w:r>
+        <w:t xml:space="preserve"> add azure-storage-blob</w:t>
+      </w:r>
+    </w:p>
+    <w:p>
+      <w:pPr>
+        <w:pStyle w:val="ListParagraph"/>
+        <w:numPr>
+          <w:ilvl w:val="0"/>
+          <w:numId w:val="40"/>
+        </w:numPr>
+      </w:pPr>
+      <w:r>
+        <w:t xml:space="preserve">Add Azure Functions extension in </w:t>
+      </w:r>
+      <w:proofErr w:type="spellStart"/>
+      <w:r>
+        <w:t>VSCode</w:t>
+      </w:r>
+      <w:proofErr w:type="spellEnd"/>
+    </w:p>
+    <w:p>
+      <w:pPr>
+        <w:pStyle w:val="ListParagraph"/>
+        <w:numPr>
+          <w:ilvl w:val="0"/>
+          <w:numId w:val="40"/>
+        </w:numPr>
+      </w:pPr>
+      <w:r>
+        <w:t>Run this test script:</w:t>
+      </w:r>
+    </w:p>
+    <w:p>
+      <w:pPr>
+        <w:pStyle w:val="ListParagraph"/>
+        <w:numPr>
+          <w:ilvl w:val="0"/>
+          <w:numId w:val="40"/>
+        </w:numPr>
+        <w:shd w:val="clear" w:color="auto" w:fill="121314"/>
+        <w:spacing w:after="0" w:line="285" w:lineRule="atLeast"/>
+        <w:rPr>
+          <w:rFonts w:ascii="Consolas" w:eastAsia="Times New Roman" w:hAnsi="Consolas" w:cs="Times New Roman"/>
+          <w:color w:val="BBBEBF"/>
+          <w:kern w:val="0"/>
+          <w:sz w:val="21"/>
+          <w:szCs w:val="21"/>
+          <w14:ligatures w14:val="none"/>
+        </w:rPr>
+      </w:pPr>
+      <w:proofErr w:type="spellStart"/>
+      <w:r>
+        <w:rPr>
+          <w:rFonts w:ascii="Consolas" w:eastAsia="Times New Roman" w:hAnsi="Consolas" w:cs="Times New Roman"/>
+          <w:color w:val="C9D1D9"/>
+          <w:kern w:val="0"/>
+          <w:sz w:val="21"/>
+          <w:szCs w:val="21"/>
+          <w14:ligatures w14:val="none"/>
+        </w:rPr>
+        <w:t>conn_string</w:t>
+      </w:r>
+      <w:proofErr w:type="spellEnd"/>
+      <w:r>
+        <w:rPr>
+          <w:rFonts w:ascii="Consolas" w:eastAsia="Times New Roman" w:hAnsi="Consolas" w:cs="Times New Roman"/>
+          <w:color w:val="BBBEBF"/>
+          <w:kern w:val="0"/>
+          <w:sz w:val="21"/>
+          <w:szCs w:val="21"/>
+          <w14:ligatures w14:val="none"/>
+        </w:rPr>
+        <w:t xml:space="preserve"> </w:t>
+      </w:r>
+      <w:r>
+        <w:rPr>
+          <w:rFonts w:ascii="Consolas" w:eastAsia="Times New Roman" w:hAnsi="Consolas" w:cs="Times New Roman"/>
+          <w:color w:val="D4D4D4"/>
+          <w:kern w:val="0"/>
+          <w:sz w:val="21"/>
+          <w:szCs w:val="21"/>
+          <w14:ligatures w14:val="none"/>
+        </w:rPr>
+        <w:t>=</w:t>
+      </w:r>
+      <w:r>
+        <w:rPr>
+          <w:rFonts w:ascii="Consolas" w:eastAsia="Times New Roman" w:hAnsi="Consolas" w:cs="Times New Roman"/>
+          <w:color w:val="BBBEBF"/>
+          <w:kern w:val="0"/>
+          <w:sz w:val="21"/>
+          <w:szCs w:val="21"/>
+          <w14:ligatures w14:val="none"/>
+        </w:rPr>
+        <w:t xml:space="preserve"> </w:t>
+      </w:r>
+      <w:r>
+        <w:rPr>
+          <w:rFonts w:ascii="Consolas" w:eastAsia="Times New Roman" w:hAnsi="Consolas" w:cs="Times New Roman"/>
+          <w:color w:val="A5D6FF"/>
+          <w:kern w:val="0"/>
+          <w:sz w:val="21"/>
+          <w:szCs w:val="21"/>
+          <w14:ligatures w14:val="none"/>
+        </w:rPr>
+        <w:t>"</w:t>
+      </w:r>
+      <w:r>
+        <w:rPr>
+          <w:rFonts w:ascii="Consolas" w:eastAsia="Times New Roman" w:hAnsi="Consolas" w:cs="Times New Roman"/>
+          <w:color w:val="A5D6FF"/>
+          <w:kern w:val="0"/>
+          <w:sz w:val="21"/>
+          <w:szCs w:val="21"/>
+          <w14:ligatures w14:val="none"/>
+        </w:rPr>
+        <w:t>connection string</w:t>
+      </w:r>
+      <w:r>
+        <w:rPr>
+          <w:rFonts w:ascii="Consolas" w:eastAsia="Times New Roman" w:hAnsi="Consolas" w:cs="Times New Roman"/>
+          <w:color w:val="A5D6FF"/>
+          <w:kern w:val="0"/>
+          <w:sz w:val="21"/>
+          <w:szCs w:val="21"/>
+          <w14:ligatures w14:val="none"/>
+        </w:rPr>
+        <w:t>"</w:t>
+      </w:r>
+    </w:p>
+    <w:p>
+      <w:pPr>
+        <w:pStyle w:val="ListParagraph"/>
+        <w:numPr>
+          <w:ilvl w:val="0"/>
+          <w:numId w:val="40"/>
+        </w:numPr>
+        <w:shd w:val="clear" w:color="auto" w:fill="121314"/>
+        <w:spacing w:after="0" w:line="285" w:lineRule="atLeast"/>
+        <w:rPr>
+          <w:rFonts w:ascii="Consolas" w:eastAsia="Times New Roman" w:hAnsi="Consolas" w:cs="Times New Roman"/>
+          <w:color w:val="BBBEBF"/>
+          <w:kern w:val="0"/>
+          <w:sz w:val="21"/>
+          <w:szCs w:val="21"/>
+          <w14:ligatures w14:val="none"/>
+        </w:rPr>
+      </w:pPr>
+    </w:p>
+    <w:p>
+      <w:pPr>
+        <w:pStyle w:val="ListParagraph"/>
+        <w:numPr>
+          <w:ilvl w:val="0"/>
+          <w:numId w:val="40"/>
+        </w:numPr>
+        <w:shd w:val="clear" w:color="auto" w:fill="121314"/>
+        <w:spacing w:after="0" w:line="285" w:lineRule="atLeast"/>
+        <w:rPr>
+          <w:rFonts w:ascii="Consolas" w:eastAsia="Times New Roman" w:hAnsi="Consolas" w:cs="Times New Roman"/>
+          <w:color w:val="BBBEBF"/>
+          <w:kern w:val="0"/>
+          <w:sz w:val="21"/>
+          <w:szCs w:val="21"/>
+          <w14:ligatures w14:val="none"/>
+        </w:rPr>
+      </w:pPr>
+      <w:r>
+        <w:rPr>
+          <w:rFonts w:ascii="Consolas" w:eastAsia="Times New Roman" w:hAnsi="Consolas" w:cs="Times New Roman"/>
+          <w:color w:val="C9D1D9"/>
+          <w:kern w:val="0"/>
+          <w:sz w:val="21"/>
+          <w:szCs w:val="21"/>
+          <w14:ligatures w14:val="none"/>
+        </w:rPr>
+        <w:t>service</w:t>
+      </w:r>
+      <w:r>
+        <w:rPr>
+          <w:rFonts w:ascii="Consolas" w:eastAsia="Times New Roman" w:hAnsi="Consolas" w:cs="Times New Roman"/>
+          <w:color w:val="BBBEBF"/>
+          <w:kern w:val="0"/>
+          <w:sz w:val="21"/>
+          <w:szCs w:val="21"/>
+          <w14:ligatures w14:val="none"/>
+        </w:rPr>
+        <w:t xml:space="preserve"> </w:t>
+      </w:r>
+      <w:r>
+        <w:rPr>
+          <w:rFonts w:ascii="Consolas" w:eastAsia="Times New Roman" w:hAnsi="Consolas" w:cs="Times New Roman"/>
+          <w:color w:val="D4D4D4"/>
+          <w:kern w:val="0"/>
+          <w:sz w:val="21"/>
+          <w:szCs w:val="21"/>
+          <w14:ligatures w14:val="none"/>
+        </w:rPr>
+        <w:t>=</w:t>
+      </w:r>
+      <w:r>
+        <w:rPr>
+          <w:rFonts w:ascii="Consolas" w:eastAsia="Times New Roman" w:hAnsi="Consolas" w:cs="Times New Roman"/>
+          <w:color w:val="BBBEBF"/>
+          <w:kern w:val="0"/>
+          <w:sz w:val="21"/>
+          <w:szCs w:val="21"/>
+          <w14:ligatures w14:val="none"/>
+        </w:rPr>
+        <w:t xml:space="preserve"> </w:t>
+      </w:r>
+      <w:proofErr w:type="spellStart"/>
+      <w:r>
+        <w:rPr>
+          <w:rFonts w:ascii="Consolas" w:eastAsia="Times New Roman" w:hAnsi="Consolas" w:cs="Times New Roman"/>
+          <w:color w:val="BBBEBF"/>
+          <w:kern w:val="0"/>
+          <w:sz w:val="21"/>
+          <w:szCs w:val="21"/>
+          <w14:ligatures w14:val="none"/>
+        </w:rPr>
+        <w:t>BlobServiceClient.from_connection_string</w:t>
+      </w:r>
+      <w:proofErr w:type="spellEnd"/>
+      <w:r>
+        <w:rPr>
+          <w:rFonts w:ascii="Consolas" w:eastAsia="Times New Roman" w:hAnsi="Consolas" w:cs="Times New Roman"/>
+          <w:color w:val="BBBEBF"/>
+          <w:kern w:val="0"/>
+          <w:sz w:val="21"/>
+          <w:szCs w:val="21"/>
+          <w14:ligatures w14:val="none"/>
+        </w:rPr>
+        <w:t>(</w:t>
+      </w:r>
+    </w:p>
+    <w:p>
+      <w:pPr>
+        <w:pStyle w:val="ListParagraph"/>
+        <w:numPr>
+          <w:ilvl w:val="0"/>
+          <w:numId w:val="40"/>
+        </w:numPr>
+        <w:shd w:val="clear" w:color="auto" w:fill="121314"/>
+        <w:spacing w:after="0" w:line="285" w:lineRule="atLeast"/>
+        <w:rPr>
+          <w:rFonts w:ascii="Consolas" w:eastAsia="Times New Roman" w:hAnsi="Consolas" w:cs="Times New Roman"/>
+          <w:color w:val="BBBEBF"/>
+          <w:kern w:val="0"/>
+          <w:sz w:val="21"/>
+          <w:szCs w:val="21"/>
+          <w14:ligatures w14:val="none"/>
+        </w:rPr>
+      </w:pPr>
+      <w:r>
+        <w:rPr>
+          <w:rFonts w:ascii="Consolas" w:eastAsia="Times New Roman" w:hAnsi="Consolas" w:cs="Times New Roman"/>
+          <w:color w:val="BBBEBF"/>
+          <w:kern w:val="0"/>
+          <w:sz w:val="21"/>
+          <w:szCs w:val="21"/>
+          <w14:ligatures w14:val="none"/>
+        </w:rPr>
+        <w:t xml:space="preserve">    </w:t>
+      </w:r>
+      <w:proofErr w:type="spellStart"/>
+      <w:r>
+        <w:rPr>
+          <w:rFonts w:ascii="Consolas" w:eastAsia="Times New Roman" w:hAnsi="Consolas" w:cs="Times New Roman"/>
+          <w:color w:val="C9D1D9"/>
+          <w:kern w:val="0"/>
+          <w:sz w:val="21"/>
+          <w:szCs w:val="21"/>
+          <w14:ligatures w14:val="none"/>
+        </w:rPr>
+        <w:t>conn_string</w:t>
+      </w:r>
+      <w:proofErr w:type="spellEnd"/>
+    </w:p>
+    <w:p>
+      <w:pPr>
+        <w:pStyle w:val="ListParagraph"/>
+        <w:numPr>
+          <w:ilvl w:val="0"/>
+          <w:numId w:val="40"/>
+        </w:numPr>
+        <w:shd w:val="clear" w:color="auto" w:fill="121314"/>
+        <w:spacing w:after="0" w:line="285" w:lineRule="atLeast"/>
+        <w:rPr>
+          <w:rFonts w:ascii="Consolas" w:eastAsia="Times New Roman" w:hAnsi="Consolas" w:cs="Times New Roman"/>
+          <w:color w:val="BBBEBF"/>
+          <w:kern w:val="0"/>
+          <w:sz w:val="21"/>
+          <w:szCs w:val="21"/>
+          <w14:ligatures w14:val="none"/>
+        </w:rPr>
+      </w:pPr>
+      <w:r>
+        <w:rPr>
+          <w:rFonts w:ascii="Consolas" w:eastAsia="Times New Roman" w:hAnsi="Consolas" w:cs="Times New Roman"/>
+          <w:color w:val="BBBEBF"/>
+          <w:kern w:val="0"/>
+          <w:sz w:val="21"/>
+          <w:szCs w:val="21"/>
+          <w14:ligatures w14:val="none"/>
+        </w:rPr>
+        <w:t>)</w:t>
+      </w:r>
+    </w:p>
+    <w:p>
+      <w:pPr>
+        <w:pStyle w:val="ListParagraph"/>
+        <w:numPr>
+          <w:ilvl w:val="0"/>
+          <w:numId w:val="40"/>
+        </w:numPr>
+        <w:shd w:val="clear" w:color="auto" w:fill="121314"/>
+        <w:spacing w:after="0" w:line="285" w:lineRule="atLeast"/>
+        <w:rPr>
+          <w:rFonts w:ascii="Consolas" w:eastAsia="Times New Roman" w:hAnsi="Consolas" w:cs="Times New Roman"/>
+          <w:color w:val="BBBEBF"/>
+          <w:kern w:val="0"/>
+          <w:sz w:val="21"/>
+          <w:szCs w:val="21"/>
+          <w14:ligatures w14:val="none"/>
+        </w:rPr>
+      </w:pPr>
+    </w:p>
+    <w:p>
+      <w:pPr>
+        <w:pStyle w:val="ListParagraph"/>
+        <w:numPr>
+          <w:ilvl w:val="0"/>
+          <w:numId w:val="40"/>
+        </w:numPr>
+        <w:shd w:val="clear" w:color="auto" w:fill="121314"/>
+        <w:spacing w:after="0" w:line="285" w:lineRule="atLeast"/>
+        <w:rPr>
+          <w:rFonts w:ascii="Consolas" w:eastAsia="Times New Roman" w:hAnsi="Consolas" w:cs="Times New Roman"/>
+          <w:color w:val="BBBEBF"/>
+          <w:kern w:val="0"/>
+          <w:sz w:val="21"/>
+          <w:szCs w:val="21"/>
+          <w14:ligatures w14:val="none"/>
+        </w:rPr>
+      </w:pPr>
+      <w:r>
+        <w:rPr>
+          <w:rFonts w:ascii="Consolas" w:eastAsia="Times New Roman" w:hAnsi="Consolas" w:cs="Times New Roman"/>
+          <w:color w:val="C9D1D9"/>
+          <w:kern w:val="0"/>
+          <w:sz w:val="21"/>
+          <w:szCs w:val="21"/>
+          <w14:ligatures w14:val="none"/>
+        </w:rPr>
+        <w:lastRenderedPageBreak/>
+        <w:t>containers</w:t>
+      </w:r>
+      <w:r>
+        <w:rPr>
+          <w:rFonts w:ascii="Consolas" w:eastAsia="Times New Roman" w:hAnsi="Consolas" w:cs="Times New Roman"/>
+          <w:color w:val="BBBEBF"/>
+          <w:kern w:val="0"/>
+          <w:sz w:val="21"/>
+          <w:szCs w:val="21"/>
+          <w14:ligatures w14:val="none"/>
+        </w:rPr>
+        <w:t xml:space="preserve"> </w:t>
+      </w:r>
+      <w:r>
+        <w:rPr>
+          <w:rFonts w:ascii="Consolas" w:eastAsia="Times New Roman" w:hAnsi="Consolas" w:cs="Times New Roman"/>
+          <w:color w:val="D4D4D4"/>
+          <w:kern w:val="0"/>
+          <w:sz w:val="21"/>
+          <w:szCs w:val="21"/>
+          <w14:ligatures w14:val="none"/>
+        </w:rPr>
+        <w:t>=</w:t>
+      </w:r>
+      <w:r>
+        <w:rPr>
+          <w:rFonts w:ascii="Consolas" w:eastAsia="Times New Roman" w:hAnsi="Consolas" w:cs="Times New Roman"/>
+          <w:color w:val="BBBEBF"/>
+          <w:kern w:val="0"/>
+          <w:sz w:val="21"/>
+          <w:szCs w:val="21"/>
+          <w14:ligatures w14:val="none"/>
+        </w:rPr>
+        <w:t xml:space="preserve"> </w:t>
+      </w:r>
+      <w:proofErr w:type="spellStart"/>
+      <w:r>
+        <w:rPr>
+          <w:rFonts w:ascii="Consolas" w:eastAsia="Times New Roman" w:hAnsi="Consolas" w:cs="Times New Roman"/>
+          <w:color w:val="C9D1D9"/>
+          <w:kern w:val="0"/>
+          <w:sz w:val="21"/>
+          <w:szCs w:val="21"/>
+          <w14:ligatures w14:val="none"/>
+        </w:rPr>
+        <w:t>service</w:t>
+      </w:r>
+      <w:r>
+        <w:rPr>
+          <w:rFonts w:ascii="Consolas" w:eastAsia="Times New Roman" w:hAnsi="Consolas" w:cs="Times New Roman"/>
+          <w:color w:val="BBBEBF"/>
+          <w:kern w:val="0"/>
+          <w:sz w:val="21"/>
+          <w:szCs w:val="21"/>
+          <w14:ligatures w14:val="none"/>
+        </w:rPr>
+        <w:t>.list_containers</w:t>
+      </w:r>
+      <w:proofErr w:type="spellEnd"/>
+      <w:r>
+        <w:rPr>
+          <w:rFonts w:ascii="Consolas" w:eastAsia="Times New Roman" w:hAnsi="Consolas" w:cs="Times New Roman"/>
+          <w:color w:val="BBBEBF"/>
+          <w:kern w:val="0"/>
+          <w:sz w:val="21"/>
+          <w:szCs w:val="21"/>
+          <w14:ligatures w14:val="none"/>
+        </w:rPr>
+        <w:t>()</w:t>
+      </w:r>
+    </w:p>
+    <w:p>
+      <w:pPr>
+        <w:pStyle w:val="ListParagraph"/>
+        <w:numPr>
+          <w:ilvl w:val="0"/>
+          <w:numId w:val="40"/>
+        </w:numPr>
+        <w:shd w:val="clear" w:color="auto" w:fill="121314"/>
+        <w:spacing w:after="0" w:line="285" w:lineRule="atLeast"/>
+        <w:rPr>
+          <w:rFonts w:ascii="Consolas" w:eastAsia="Times New Roman" w:hAnsi="Consolas" w:cs="Times New Roman"/>
+          <w:color w:val="BBBEBF"/>
+          <w:kern w:val="0"/>
+          <w:sz w:val="21"/>
+          <w:szCs w:val="21"/>
+          <w14:ligatures w14:val="none"/>
+        </w:rPr>
+      </w:pPr>
+    </w:p>
+    <w:p>
+      <w:pPr>
+        <w:pStyle w:val="ListParagraph"/>
+        <w:numPr>
+          <w:ilvl w:val="0"/>
+          <w:numId w:val="40"/>
+        </w:numPr>
+        <w:shd w:val="clear" w:color="auto" w:fill="121314"/>
+        <w:spacing w:after="0" w:line="285" w:lineRule="atLeast"/>
+        <w:rPr>
+          <w:rFonts w:ascii="Consolas" w:eastAsia="Times New Roman" w:hAnsi="Consolas" w:cs="Times New Roman"/>
+          <w:color w:val="BBBEBF"/>
+          <w:kern w:val="0"/>
+          <w:sz w:val="21"/>
+          <w:szCs w:val="21"/>
+          <w14:ligatures w14:val="none"/>
+        </w:rPr>
+      </w:pPr>
+      <w:r>
+        <w:rPr>
+          <w:rFonts w:ascii="Consolas" w:eastAsia="Times New Roman" w:hAnsi="Consolas" w:cs="Times New Roman"/>
+          <w:color w:val="C586C0"/>
+          <w:kern w:val="0"/>
+          <w:sz w:val="21"/>
+          <w:szCs w:val="21"/>
+          <w14:ligatures w14:val="none"/>
+        </w:rPr>
+        <w:t>for</w:t>
+      </w:r>
+      <w:r>
+        <w:rPr>
+          <w:rFonts w:ascii="Consolas" w:eastAsia="Times New Roman" w:hAnsi="Consolas" w:cs="Times New Roman"/>
+          <w:color w:val="BBBEBF"/>
+          <w:kern w:val="0"/>
+          <w:sz w:val="21"/>
+          <w:szCs w:val="21"/>
+          <w14:ligatures w14:val="none"/>
+        </w:rPr>
+        <w:t xml:space="preserve"> </w:t>
+      </w:r>
+      <w:r>
+        <w:rPr>
+          <w:rFonts w:ascii="Consolas" w:eastAsia="Times New Roman" w:hAnsi="Consolas" w:cs="Times New Roman"/>
+          <w:color w:val="C9D1D9"/>
+          <w:kern w:val="0"/>
+          <w:sz w:val="21"/>
+          <w:szCs w:val="21"/>
+          <w14:ligatures w14:val="none"/>
+        </w:rPr>
+        <w:t>container</w:t>
+      </w:r>
+      <w:r>
+        <w:rPr>
+          <w:rFonts w:ascii="Consolas" w:eastAsia="Times New Roman" w:hAnsi="Consolas" w:cs="Times New Roman"/>
+          <w:color w:val="BBBEBF"/>
+          <w:kern w:val="0"/>
+          <w:sz w:val="21"/>
+          <w:szCs w:val="21"/>
+          <w14:ligatures w14:val="none"/>
+        </w:rPr>
+        <w:t xml:space="preserve"> </w:t>
+      </w:r>
+      <w:r>
+        <w:rPr>
+          <w:rFonts w:ascii="Consolas" w:eastAsia="Times New Roman" w:hAnsi="Consolas" w:cs="Times New Roman"/>
+          <w:color w:val="C586C0"/>
+          <w:kern w:val="0"/>
+          <w:sz w:val="21"/>
+          <w:szCs w:val="21"/>
+          <w14:ligatures w14:val="none"/>
+        </w:rPr>
+        <w:t>in</w:t>
+      </w:r>
+      <w:r>
+        <w:rPr>
+          <w:rFonts w:ascii="Consolas" w:eastAsia="Times New Roman" w:hAnsi="Consolas" w:cs="Times New Roman"/>
+          <w:color w:val="BBBEBF"/>
+          <w:kern w:val="0"/>
+          <w:sz w:val="21"/>
+          <w:szCs w:val="21"/>
+          <w14:ligatures w14:val="none"/>
+        </w:rPr>
+        <w:t xml:space="preserve"> </w:t>
+      </w:r>
+      <w:r>
+        <w:rPr>
+          <w:rFonts w:ascii="Consolas" w:eastAsia="Times New Roman" w:hAnsi="Consolas" w:cs="Times New Roman"/>
+          <w:color w:val="C9D1D9"/>
+          <w:kern w:val="0"/>
+          <w:sz w:val="21"/>
+          <w:szCs w:val="21"/>
+          <w14:ligatures w14:val="none"/>
+        </w:rPr>
+        <w:t>containers</w:t>
+      </w:r>
+      <w:r>
+        <w:rPr>
+          <w:rFonts w:ascii="Consolas" w:eastAsia="Times New Roman" w:hAnsi="Consolas" w:cs="Times New Roman"/>
+          <w:color w:val="BBBEBF"/>
+          <w:kern w:val="0"/>
+          <w:sz w:val="21"/>
+          <w:szCs w:val="21"/>
+          <w14:ligatures w14:val="none"/>
+        </w:rPr>
+        <w:t>:</w:t>
+      </w:r>
+    </w:p>
+    <w:p>
+      <w:pPr>
+        <w:pStyle w:val="ListParagraph"/>
+        <w:numPr>
+          <w:ilvl w:val="0"/>
+          <w:numId w:val="40"/>
+        </w:numPr>
+        <w:shd w:val="clear" w:color="auto" w:fill="121314"/>
+        <w:spacing w:after="0" w:line="285" w:lineRule="atLeast"/>
+        <w:rPr>
+          <w:rFonts w:ascii="Consolas" w:eastAsia="Times New Roman" w:hAnsi="Consolas" w:cs="Times New Roman"/>
+          <w:color w:val="BBBEBF"/>
+          <w:kern w:val="0"/>
+          <w:sz w:val="21"/>
+          <w:szCs w:val="21"/>
+          <w14:ligatures w14:val="none"/>
+        </w:rPr>
+      </w:pPr>
+      <w:r>
+        <w:rPr>
+          <w:rFonts w:ascii="Consolas" w:eastAsia="Times New Roman" w:hAnsi="Consolas" w:cs="Times New Roman"/>
+          <w:color w:val="BBBEBF"/>
+          <w:kern w:val="0"/>
+          <w:sz w:val="21"/>
+          <w:szCs w:val="21"/>
+          <w14:ligatures w14:val="none"/>
+        </w:rPr>
+        <w:t xml:space="preserve">    </w:t>
+      </w:r>
+      <w:r>
+        <w:rPr>
+          <w:rFonts w:ascii="Consolas" w:eastAsia="Times New Roman" w:hAnsi="Consolas" w:cs="Times New Roman"/>
+          <w:color w:val="D2A8FF"/>
+          <w:kern w:val="0"/>
+          <w:sz w:val="21"/>
+          <w:szCs w:val="21"/>
+          <w14:ligatures w14:val="none"/>
+        </w:rPr>
+        <w:t>print</w:t>
+      </w:r>
+      <w:r>
+        <w:rPr>
+          <w:rFonts w:ascii="Consolas" w:eastAsia="Times New Roman" w:hAnsi="Consolas" w:cs="Times New Roman"/>
+          <w:color w:val="BBBEBF"/>
+          <w:kern w:val="0"/>
+          <w:sz w:val="21"/>
+          <w:szCs w:val="21"/>
+          <w14:ligatures w14:val="none"/>
+        </w:rPr>
+        <w:t>(</w:t>
+      </w:r>
+      <w:r>
+        <w:rPr>
+          <w:rFonts w:ascii="Consolas" w:eastAsia="Times New Roman" w:hAnsi="Consolas" w:cs="Times New Roman"/>
+          <w:color w:val="C9D1D9"/>
+          <w:kern w:val="0"/>
+          <w:sz w:val="21"/>
+          <w:szCs w:val="21"/>
+          <w14:ligatures w14:val="none"/>
+        </w:rPr>
+        <w:t>container</w:t>
+      </w:r>
+      <w:r>
+        <w:rPr>
+          <w:rFonts w:ascii="Consolas" w:eastAsia="Times New Roman" w:hAnsi="Consolas" w:cs="Times New Roman"/>
+          <w:color w:val="BBBEBF"/>
+          <w:kern w:val="0"/>
+          <w:sz w:val="21"/>
+          <w:szCs w:val="21"/>
+          <w14:ligatures w14:val="none"/>
+        </w:rPr>
+        <w:t>.name)</w:t>
+      </w:r>
+    </w:p>
+    <w:p>
+      <w:pPr>
+        <w:pStyle w:val="Subtitle"/>
+      </w:pPr>
+    </w:p>
+    <w:p>
+      <w:pPr>
+        <w:pStyle w:val="Subtitle"/>
+      </w:pPr>
+      <w:r>
+        <w:t>Key Vault</w:t>
+      </w:r>
+    </w:p>
+    <w:p>
+      <w:pPr>
+        <w:pStyle w:val="Subtitle"/>
+      </w:pPr>
+      <w:r>
+        <w:t>Azure Function</w:t>
+      </w:r>
+    </w:p>
+    <w:p>
+      <w:r>
+        <w:t>(</w:t>
+      </w:r>
+      <w:hyperlink r:id="rId7" w:history="1">
+        <w:r>
+          <w:rPr>
+            <w:rStyle w:val="Hyperlink"/>
+          </w:rPr>
+          <w:t>Getting Started with Azure Functions Tutorial [Example-Driven Guide]</w:t>
+        </w:r>
+      </w:hyperlink>
+      <w:r>
+        <w:t>)</w:t>
+      </w:r>
+    </w:p>
+    <w:p>
+      <w:r>
+        <w:t>create an Azure Function that automatically ingests data (for example from ClinicalTrials.gov) and stores it in Blob Storage.</w:t>
+      </w:r>
+    </w:p>
+    <w:p/>
+    <w:tbl>
+      <w:tblPr>
+        <w:tblStyle w:val="TableGrid"/>
+        <w:tblW w:w="0" w:type="auto"/>
+        <w:tblLook w:val="04A0" w:firstRow="1" w:lastRow="0" w:firstColumn="1" w:lastColumn="0" w:noHBand="0" w:noVBand="1"/>
+      </w:tblPr>
+      <w:tblGrid>
+        <w:gridCol w:w="4675"/>
+        <w:gridCol w:w="4675"/>
+      </w:tblGrid>
+      <w:tr>
+        <w:tc>
+          <w:tcPr>
+            <w:tcW w:w="4675" w:type="dxa"/>
+            <w:tcBorders>
+              <w:top w:val="single" w:sz="4" w:space="0" w:color="auto"/>
+              <w:left w:val="single" w:sz="4" w:space="0" w:color="auto"/>
+              <w:right w:val="single" w:sz="4" w:space="0" w:color="auto"/>
+            </w:tcBorders>
+          </w:tcPr>
+          <w:p>
+            <w:r>
+              <w:t>Function App</w:t>
+            </w:r>
+          </w:p>
+        </w:tc>
+        <w:tc>
+          <w:tcPr>
+            <w:tcW w:w="4675" w:type="dxa"/>
+            <w:tcBorders>
+              <w:top w:val="single" w:sz="4" w:space="0" w:color="auto"/>
+              <w:left w:val="single" w:sz="4" w:space="0" w:color="auto"/>
+              <w:right w:val="single" w:sz="4" w:space="0" w:color="auto"/>
+            </w:tcBorders>
+          </w:tcPr>
+          <w:p>
+            <w:proofErr w:type="spellStart"/>
+            <w:r>
+              <w:t>func</w:t>
+            </w:r>
+            <w:proofErr w:type="spellEnd"/>
+            <w:r>
+              <w:t>-pharma-ingestion</w:t>
+            </w:r>
+          </w:p>
+          <w:p/>
+        </w:tc>
+      </w:tr>
+      <w:tr>
+        <w:tc>
+          <w:tcPr>
+            <w:tcW w:w="4675" w:type="dxa"/>
+            <w:tcBorders>
+              <w:left w:val="single" w:sz="4" w:space="0" w:color="auto"/>
+            </w:tcBorders>
+          </w:tcPr>
+          <w:p>
+            <w:r>
+              <w:t>Runtime</w:t>
+            </w:r>
+          </w:p>
+          <w:p/>
+        </w:tc>
+        <w:tc>
+          <w:tcPr>
+            <w:tcW w:w="4675" w:type="dxa"/>
+            <w:tcBorders>
+              <w:right w:val="single" w:sz="4" w:space="0" w:color="auto"/>
+            </w:tcBorders>
+          </w:tcPr>
+          <w:p/>
+          <w:p>
+            <w:r>
+              <w:t>Python 3.12</w:t>
+            </w:r>
+          </w:p>
+          <w:p/>
+        </w:tc>
+      </w:tr>
+      <w:tr>
+        <w:tc>
+          <w:tcPr>
+            <w:tcW w:w="4675" w:type="dxa"/>
+            <w:tcBorders>
+              <w:left w:val="single" w:sz="4" w:space="0" w:color="auto"/>
+              <w:bottom w:val="single" w:sz="4" w:space="0" w:color="auto"/>
+              <w:right w:val="single" w:sz="4" w:space="0" w:color="auto"/>
+            </w:tcBorders>
+          </w:tcPr>
+          <w:p>
+            <w:r>
+              <w:t>Hosting</w:t>
+            </w:r>
+          </w:p>
+          <w:p/>
+        </w:tc>
+        <w:tc>
+          <w:tcPr>
+            <w:tcW w:w="4675" w:type="dxa"/>
+            <w:tcBorders>
+              <w:left w:val="single" w:sz="4" w:space="0" w:color="auto"/>
+              <w:bottom w:val="single" w:sz="4" w:space="0" w:color="auto"/>
+              <w:right w:val="single" w:sz="4" w:space="0" w:color="auto"/>
+            </w:tcBorders>
+          </w:tcPr>
+          <w:p>
+            <w:r>
+              <w:t>Consumption Plan</w:t>
+            </w:r>
+          </w:p>
+          <w:p/>
+        </w:tc>
+      </w:tr>
+    </w:tbl>
+    <w:p/>
+    <w:p>
+      <w:r>
+        <w:t>Step 1: Create the Function Project</w:t>
+      </w:r>
+    </w:p>
+    <w:p>
+      <w:pPr>
+        <w:pStyle w:val="ListParagraph"/>
+      </w:pPr>
+      <w:r>
+        <w:t xml:space="preserve">1.1 Go to project folder </w:t>
+      </w:r>
+      <w:r>
+        <w:sym w:font="Wingdings" w:char="F0E0"/>
+      </w:r>
+      <w:r>
+        <w:t xml:space="preserve"> ingestion</w:t>
+      </w:r>
+    </w:p>
+    <w:p>
+      <w:pPr>
+        <w:pStyle w:val="ListParagraph"/>
+      </w:pPr>
+      <w:r>
+        <w:t>1.2 create a new folder ‘</w:t>
+      </w:r>
+      <w:r>
+        <w:t>clinical-trial-ingestion</w:t>
+      </w:r>
+      <w:r>
+        <w:t>’</w:t>
+      </w:r>
+    </w:p>
+    <w:p>
+      <w:pPr>
+        <w:pStyle w:val="ListParagraph"/>
+      </w:pPr>
+    </w:p>
+    <w:p>
+      <w:pPr>
+        <w:pStyle w:val="ListParagraph"/>
+      </w:pPr>
+      <w:proofErr w:type="spellStart"/>
+      <w:r>
+        <w:t>mkdir</w:t>
+      </w:r>
+      <w:proofErr w:type="spellEnd"/>
+      <w:r>
+        <w:t xml:space="preserve"> clinical-trial-ingestion</w:t>
+      </w:r>
+    </w:p>
+    <w:p>
+      <w:pPr>
+        <w:pStyle w:val="ListParagraph"/>
+      </w:pPr>
+      <w:r>
+        <w:t>cd clinical-trial-ingestion</w:t>
+      </w:r>
+    </w:p>
+    <w:p>
+      <w:r>
+        <w:t>Step 2: Create Function App</w:t>
+      </w:r>
+    </w:p>
+    <w:p>
+      <w:r>
+        <w:t>In VS Code:</w:t>
+      </w:r>
+    </w:p>
+    <w:p>
+      <w:r>
+        <w:t>Ctrl + Shift + P</w:t>
+      </w:r>
+    </w:p>
+    <w:p>
+      <w:r>
+        <w:t>Run:</w:t>
+      </w:r>
+    </w:p>
+    <w:p>
+      <w:r>
+        <w:t>Azure Functions: Create New Project</w:t>
+      </w:r>
+    </w:p>
+    <w:p/>
+    <w:p/>
+    <w:p>
+      <w:pPr>
+        <w:pStyle w:val="ListParagraph"/>
+      </w:pPr>
+    </w:p>
+    <w:p>
+      <w:pPr>
+        <w:pStyle w:val="ListParagraph"/>
+      </w:pPr>
+    </w:p>
+    <w:p/>
+    <w:p/>
+    <w:p/>
+    <w:p/>
+    <w:p/>
+    <w:p/>
+    <w:p>
+      <w:pPr>
+        <w:rPr>
+          <w:color w:val="FF0000"/>
+        </w:rPr>
+      </w:pPr>
+    </w:p>
+    <w:p>
+      <w:pPr>
+        <w:pStyle w:val="Heading1"/>
+      </w:pPr>
+      <w:proofErr w:type="spellStart"/>
+      <w:r>
         <w:t>LangGraph</w:t>
       </w:r>
       <w:proofErr w:type="spellEnd"/>
@@ -9038,13 +10371,8 @@
       </w:r>
     </w:p>
     <w:p>
-      <w:proofErr w:type="gramStart"/>
-      <w:r>
-        <w:t>Supervisor</w:t>
-      </w:r>
-      <w:proofErr w:type="gramEnd"/>
-      <w:r>
-        <w:t xml:space="preserve"> Agent</w:t>
+      <w:r>
+        <w:t>Supervisor Agent</w:t>
       </w:r>
     </w:p>
     <w:p>
@@ -9083,6 +10411,69 @@
       </w:r>
     </w:p>
     <w:p/>
+    <w:p>
+      <w:pPr>
+        <w:rPr>
+          <w:color w:val="FF0000"/>
+        </w:rPr>
+      </w:pPr>
+    </w:p>
+    <w:p>
+      <w:pPr>
+        <w:rPr>
+          <w:color w:val="FF0000"/>
+        </w:rPr>
+      </w:pPr>
+    </w:p>
+    <w:p>
+      <w:pPr>
+        <w:rPr>
+          <w:color w:val="FF0000"/>
+        </w:rPr>
+      </w:pPr>
+    </w:p>
+    <w:p>
+      <w:pPr>
+        <w:rPr>
+          <w:color w:val="FF0000"/>
+        </w:rPr>
+      </w:pPr>
+    </w:p>
+    <w:p>
+      <w:pPr>
+        <w:rPr>
+          <w:color w:val="FF0000"/>
+        </w:rPr>
+      </w:pPr>
+    </w:p>
+    <w:p>
+      <w:pPr>
+        <w:rPr>
+          <w:color w:val="FF0000"/>
+        </w:rPr>
+      </w:pPr>
+    </w:p>
+    <w:p>
+      <w:pPr>
+        <w:rPr>
+          <w:color w:val="FF0000"/>
+        </w:rPr>
+      </w:pPr>
+    </w:p>
+    <w:p>
+      <w:pPr>
+        <w:rPr>
+          <w:color w:val="FF0000"/>
+        </w:rPr>
+      </w:pPr>
+    </w:p>
+    <w:p>
+      <w:pPr>
+        <w:rPr>
+          <w:color w:val="FF0000"/>
+        </w:rPr>
+      </w:pPr>
+    </w:p>
     <w:p>
       <w:pPr>
         <w:rPr>
@@ -9119,15 +10510,7 @@
       </w:r>
       <w:proofErr w:type="spellEnd"/>
       <w:r>
-        <w:t xml:space="preserve"> parallel execution (</w:t>
-      </w:r>
-      <w:proofErr w:type="gramStart"/>
-      <w:r>
-        <w:t>Send(</w:t>
-      </w:r>
-      <w:proofErr w:type="gramEnd"/>
-      <w:r>
-        <w:t>) fan-out/fan-in)</w:t>
+        <w:t xml:space="preserve"> parallel execution (Send() fan-out/fan-in)</w:t>
       </w:r>
     </w:p>
     <w:p>
@@ -9280,6 +10663,389 @@
       </w:pPr>
       <w:r>
         <w:t>Citation-aware RAG with source grounding</w:t>
+      </w:r>
+    </w:p>
+    <w:p/>
+    <w:p/>
+    <w:p/>
+    <w:p/>
+    <w:p/>
+    <w:p/>
+    <w:p/>
+    <w:p/>
+    <w:p/>
+    <w:p/>
+    <w:p/>
+    <w:p/>
+    <w:p/>
+    <w:p/>
+    <w:p/>
+    <w:p>
+      <w:pPr>
+        <w:pStyle w:val="ListParagraph"/>
+        <w:rPr>
+          <w:b/>
+          <w:bCs/>
+        </w:rPr>
+      </w:pPr>
+      <w:r>
+        <w:rPr>
+          <w:b/>
+          <w:bCs/>
+        </w:rPr>
+        <w:t>Resume Version (3-4 Bullet Points)</w:t>
+      </w:r>
+    </w:p>
+    <w:p>
+      <w:pPr>
+        <w:pStyle w:val="ListParagraph"/>
+      </w:pPr>
+      <w:r>
+        <w:rPr>
+          <w:b/>
+          <w:bCs/>
+        </w:rPr>
+        <w:t xml:space="preserve">Agentic Pharma Intelligence Platform | Azure OpenAI, </w:t>
+      </w:r>
+      <w:proofErr w:type="spellStart"/>
+      <w:r>
+        <w:rPr>
+          <w:b/>
+          <w:bCs/>
+        </w:rPr>
+        <w:t>LangGraph</w:t>
+      </w:r>
+      <w:proofErr w:type="spellEnd"/>
+      <w:r>
+        <w:rPr>
+          <w:b/>
+          <w:bCs/>
+        </w:rPr>
+        <w:t>, FAISS, Azure Cloud</w:t>
+      </w:r>
+    </w:p>
+    <w:p>
+      <w:pPr>
+        <w:pStyle w:val="ListParagraph"/>
+        <w:numPr>
+          <w:ilvl w:val="0"/>
+          <w:numId w:val="36"/>
+        </w:numPr>
+      </w:pPr>
+      <w:r>
+        <w:t xml:space="preserve">Designed and developed an AI-powered pharmaceutical intelligence platform leveraging </w:t>
+      </w:r>
+      <w:r>
+        <w:rPr>
+          <w:b/>
+          <w:bCs/>
+        </w:rPr>
+        <w:t xml:space="preserve">Azure OpenAI, </w:t>
+      </w:r>
+      <w:proofErr w:type="spellStart"/>
+      <w:r>
+        <w:rPr>
+          <w:b/>
+          <w:bCs/>
+        </w:rPr>
+        <w:t>LangGraph</w:t>
+      </w:r>
+      <w:proofErr w:type="spellEnd"/>
+      <w:r>
+        <w:rPr>
+          <w:b/>
+          <w:bCs/>
+        </w:rPr>
+        <w:t>, and FAISS</w:t>
+      </w:r>
+      <w:r>
+        <w:t xml:space="preserve"> to automate clinical, regulatory, and competitive monitoring across multiple healthcare data sources.</w:t>
+      </w:r>
+    </w:p>
+    <w:p>
+      <w:pPr>
+        <w:pStyle w:val="ListParagraph"/>
+        <w:numPr>
+          <w:ilvl w:val="0"/>
+          <w:numId w:val="36"/>
+        </w:numPr>
+      </w:pPr>
+      <w:r>
+        <w:t xml:space="preserve">Architected a </w:t>
+      </w:r>
+      <w:r>
+        <w:rPr>
+          <w:b/>
+          <w:bCs/>
+        </w:rPr>
+        <w:t>multi-agent reasoning framework</w:t>
+      </w:r>
+      <w:r>
+        <w:t xml:space="preserve"> using </w:t>
+      </w:r>
+      <w:proofErr w:type="spellStart"/>
+      <w:r>
+        <w:t>LangGraph</w:t>
+      </w:r>
+      <w:proofErr w:type="spellEnd"/>
+      <w:r>
+        <w:t>, enabling specialized Clinical, Regulatory, and Competitive Intelligence agents to collaboratively analyze and synthesize insights from structured and unstructured datasets.</w:t>
+      </w:r>
+    </w:p>
+    <w:p>
+      <w:pPr>
+        <w:pStyle w:val="ListParagraph"/>
+        <w:numPr>
+          <w:ilvl w:val="0"/>
+          <w:numId w:val="36"/>
+        </w:numPr>
+      </w:pPr>
+      <w:r>
+        <w:t xml:space="preserve">Built an RAG (Retrieval-Augmented Generation) pipeline integrating </w:t>
+      </w:r>
+      <w:r>
+        <w:rPr>
+          <w:b/>
+          <w:bCs/>
+        </w:rPr>
+        <w:t>ClinicalTrials.gov</w:t>
+      </w:r>
+      <w:r>
+        <w:t xml:space="preserve">, regulatory publications, and market intelligence data through </w:t>
+      </w:r>
+      <w:r>
+        <w:rPr>
+          <w:b/>
+          <w:bCs/>
+        </w:rPr>
+        <w:t>Azure Blob Storage, Azure SQL Database, and FAISS vector search</w:t>
+      </w:r>
+      <w:r>
+        <w:t xml:space="preserve"> for contextual information retrieval.</w:t>
+      </w:r>
+    </w:p>
+    <w:p>
+      <w:pPr>
+        <w:pStyle w:val="ListParagraph"/>
+        <w:numPr>
+          <w:ilvl w:val="0"/>
+          <w:numId w:val="36"/>
+        </w:numPr>
+      </w:pPr>
+      <w:r>
+        <w:t>Implemented scalable Azure-based data ingestion and orchestration workflows, reducing manual research effort and enabling faster identification of clinical trial updates, regulatory changes, and competitor activities.</w:t>
+      </w:r>
+    </w:p>
+    <w:p>
+      <w:pPr>
+        <w:pStyle w:val="ListParagraph"/>
+      </w:pPr>
+      <w:r>
+        <w:pict w14:anchorId="2827C017">
+          <v:rect id="_x0000_i1026" style="width:0;height:1.5pt" o:hralign="center" o:hrstd="t" o:hr="t" fillcolor="#a0a0a0" stroked="f"/>
+        </w:pict>
+      </w:r>
+    </w:p>
+    <w:p>
+      <w:pPr>
+        <w:pStyle w:val="ListParagraph"/>
+        <w:rPr>
+          <w:b/>
+          <w:bCs/>
+        </w:rPr>
+      </w:pPr>
+      <w:r>
+        <w:rPr>
+          <w:b/>
+          <w:bCs/>
+        </w:rPr>
+        <w:t>Resume Version for Senior Consultant / AI Consultant Roles</w:t>
+      </w:r>
+    </w:p>
+    <w:p>
+      <w:pPr>
+        <w:pStyle w:val="ListParagraph"/>
+      </w:pPr>
+      <w:r>
+        <w:rPr>
+          <w:b/>
+          <w:bCs/>
+        </w:rPr>
+        <w:t>Agentic Pharma Intelligence Platform (Personal Project)</w:t>
+      </w:r>
+    </w:p>
+    <w:p>
+      <w:pPr>
+        <w:pStyle w:val="ListParagraph"/>
+        <w:numPr>
+          <w:ilvl w:val="0"/>
+          <w:numId w:val="37"/>
+        </w:numPr>
+      </w:pPr>
+      <w:r>
+        <w:t xml:space="preserve">Led the design of an enterprise-scale GenAI solution for pharmaceutical intelligence using </w:t>
+      </w:r>
+      <w:r>
+        <w:rPr>
+          <w:b/>
+          <w:bCs/>
+        </w:rPr>
+        <w:t xml:space="preserve">Azure OpenAI, </w:t>
+      </w:r>
+      <w:proofErr w:type="spellStart"/>
+      <w:r>
+        <w:rPr>
+          <w:b/>
+          <w:bCs/>
+        </w:rPr>
+        <w:t>LangGraph</w:t>
+      </w:r>
+      <w:proofErr w:type="spellEnd"/>
+      <w:r>
+        <w:rPr>
+          <w:b/>
+          <w:bCs/>
+        </w:rPr>
+        <w:t xml:space="preserve"> orchestration, FAISS vector search, and Azure cloud services</w:t>
+      </w:r>
+      <w:r>
+        <w:t>.</w:t>
+      </w:r>
+    </w:p>
+    <w:p>
+      <w:pPr>
+        <w:pStyle w:val="ListParagraph"/>
+        <w:numPr>
+          <w:ilvl w:val="0"/>
+          <w:numId w:val="37"/>
+        </w:numPr>
+      </w:pPr>
+      <w:r>
+        <w:t xml:space="preserve">Developed a multi-agent architecture comprising </w:t>
+      </w:r>
+      <w:r>
+        <w:rPr>
+          <w:b/>
+          <w:bCs/>
+        </w:rPr>
+        <w:t>Clinical Intelligence, Regulatory Intelligence, and Competitive Intelligence agents</w:t>
+      </w:r>
+      <w:r>
+        <w:t xml:space="preserve"> capable of autonomous reasoning, evidence retrieval, and report generation.</w:t>
+      </w:r>
+    </w:p>
+    <w:p>
+      <w:pPr>
+        <w:pStyle w:val="ListParagraph"/>
+        <w:numPr>
+          <w:ilvl w:val="0"/>
+          <w:numId w:val="37"/>
+        </w:numPr>
+      </w:pPr>
+      <w:r>
+        <w:t>Engineered an end-to-end RAG architecture incorporating external healthcare datasets, vector embeddings, and knowledge retrieval to support data-driven decision making for pharmaceutical stakeholders.</w:t>
+      </w:r>
+    </w:p>
+    <w:p>
+      <w:pPr>
+        <w:pStyle w:val="ListParagraph"/>
+        <w:numPr>
+          <w:ilvl w:val="0"/>
+          <w:numId w:val="37"/>
+        </w:numPr>
+      </w:pPr>
+      <w:r>
+        <w:lastRenderedPageBreak/>
+        <w:t xml:space="preserve">Defined cloud architecture including </w:t>
+      </w:r>
+      <w:r>
+        <w:rPr>
+          <w:b/>
+          <w:bCs/>
+        </w:rPr>
+        <w:t>Azure Functions, Blob Storage, Azure SQL, and vector databases</w:t>
+      </w:r>
+      <w:r>
+        <w:t>, ensuring scalable ingestion, storage, retrieval, and agent orchestration workflows.</w:t>
+      </w:r>
+    </w:p>
+    <w:p>
+      <w:pPr>
+        <w:pStyle w:val="ListParagraph"/>
+        <w:numPr>
+          <w:ilvl w:val="0"/>
+          <w:numId w:val="37"/>
+        </w:numPr>
+      </w:pPr>
+      <w:r>
+        <w:t>Demonstrated application of LLM-based agents for life sciences use cases including clinical trial tracking, regulatory monitoring, and competitive landscape analysis.</w:t>
+      </w:r>
+    </w:p>
+    <w:p>
+      <w:pPr>
+        <w:pStyle w:val="ListParagraph"/>
+      </w:pPr>
+      <w:r>
+        <w:pict w14:anchorId="18010B99">
+          <v:rect id="_x0000_i1027" style="width:0;height:1.5pt" o:hralign="center" o:hrstd="t" o:hr="t" fillcolor="#a0a0a0" stroked="f"/>
+        </w:pict>
+      </w:r>
+    </w:p>
+    <w:p>
+      <w:pPr>
+        <w:pStyle w:val="ListParagraph"/>
+      </w:pPr>
+      <w:r>
+        <w:rPr>
+          <w:b/>
+          <w:bCs/>
+        </w:rPr>
+        <w:t>Agentic Pharma Intelligence Platform</w:t>
+      </w:r>
+      <w:r>
+        <w:br/>
+      </w:r>
+      <w:r>
+        <w:rPr>
+          <w:i/>
+          <w:iCs/>
+        </w:rPr>
+        <w:t>Technologies:</w:t>
+      </w:r>
+      <w:r>
+        <w:t xml:space="preserve"> Azure OpenAI, </w:t>
+      </w:r>
+      <w:proofErr w:type="spellStart"/>
+      <w:r>
+        <w:t>LangGraph</w:t>
+      </w:r>
+      <w:proofErr w:type="spellEnd"/>
+      <w:r>
+        <w:t xml:space="preserve">, </w:t>
+      </w:r>
+      <w:proofErr w:type="spellStart"/>
+      <w:r>
+        <w:t>LangChain</w:t>
+      </w:r>
+      <w:proofErr w:type="spellEnd"/>
+      <w:r>
+        <w:t>, Python, FAISS, Azure SQL, Azure Blob Storage, Azure Functions, RAG, Vector Search, LLM Agents</w:t>
+      </w:r>
+    </w:p>
+    <w:p>
+      <w:pPr>
+        <w:pStyle w:val="ListParagraph"/>
+      </w:pPr>
+      <w:r>
+        <w:t xml:space="preserve">Designed and implemented an AI-powered pharmaceutical intelligence platform that leverages Retrieval-Augmented Generation (RAG) and multi-agent reasoning to monitor clinical trials, regulatory updates, and competitor activities. Built specialized </w:t>
+      </w:r>
+      <w:proofErr w:type="spellStart"/>
+      <w:r>
+        <w:t>LangGraph</w:t>
+      </w:r>
+      <w:proofErr w:type="spellEnd"/>
+      <w:r>
+        <w:t xml:space="preserve"> agents integrated with Azure OpenAI and FAISS vector search to generate evidence-backed insights from diverse healthcare data sources.</w:t>
       </w:r>
     </w:p>
     <w:p>
@@ -9840,6 +11606,95 @@
     </w:lvl>
   </w:abstractNum>
   <w:abstractNum w:abstractNumId="4" w15:restartNumberingAfterBreak="0">
+    <w:nsid w:val="138768C1"/>
+    <w:multiLevelType w:val="hybridMultilevel"/>
+    <w:tmpl w:val="FA2E83A0"/>
+    <w:lvl w:ilvl="0" w:tplc="0409000F">
+      <w:start w:val="1"/>
+      <w:numFmt w:val="decimal"/>
+      <w:lvlText w:val="%1."/>
+      <w:lvlJc w:val="left"/>
+      <w:pPr>
+        <w:ind w:left="720" w:hanging="360"/>
+      </w:pPr>
+      <w:rPr>
+        <w:rFonts w:hint="default"/>
+      </w:rPr>
+    </w:lvl>
+    <w:lvl w:ilvl="1" w:tplc="04090019" w:tentative="1">
+      <w:start w:val="1"/>
+      <w:numFmt w:val="lowerLetter"/>
+      <w:lvlText w:val="%2."/>
+      <w:lvlJc w:val="left"/>
+      <w:pPr>
+        <w:ind w:left="1440" w:hanging="360"/>
+      </w:pPr>
+    </w:lvl>
+    <w:lvl w:ilvl="2" w:tplc="0409001B" w:tentative="1">
+      <w:start w:val="1"/>
+      <w:numFmt w:val="lowerRoman"/>
+      <w:lvlText w:val="%3."/>
+      <w:lvlJc w:val="right"/>
+      <w:pPr>
+        <w:ind w:left="2160" w:hanging="180"/>
+      </w:pPr>
+    </w:lvl>
+    <w:lvl w:ilvl="3" w:tplc="0409000F" w:tentative="1">
+      <w:start w:val="1"/>
+      <w:numFmt w:val="decimal"/>
+      <w:lvlText w:val="%4."/>
+      <w:lvlJc w:val="left"/>
+      <w:pPr>
+        <w:ind w:left="2880" w:hanging="360"/>
+      </w:pPr>
+    </w:lvl>
+    <w:lvl w:ilvl="4" w:tplc="04090019" w:tentative="1">
+      <w:start w:val="1"/>
+      <w:numFmt w:val="lowerLetter"/>
+      <w:lvlText w:val="%5."/>
+      <w:lvlJc w:val="left"/>
+      <w:pPr>
+        <w:ind w:left="3600" w:hanging="360"/>
+      </w:pPr>
+    </w:lvl>
+    <w:lvl w:ilvl="5" w:tplc="0409001B" w:tentative="1">
+      <w:start w:val="1"/>
+      <w:numFmt w:val="lowerRoman"/>
+      <w:lvlText w:val="%6."/>
+      <w:lvlJc w:val="right"/>
+      <w:pPr>
+        <w:ind w:left="4320" w:hanging="180"/>
+      </w:pPr>
+    </w:lvl>
+    <w:lvl w:ilvl="6" w:tplc="0409000F" w:tentative="1">
+      <w:start w:val="1"/>
+      <w:numFmt w:val="decimal"/>
+      <w:lvlText w:val="%7."/>
+      <w:lvlJc w:val="left"/>
+      <w:pPr>
+        <w:ind w:left="5040" w:hanging="360"/>
+      </w:pPr>
+    </w:lvl>
+    <w:lvl w:ilvl="7" w:tplc="04090019" w:tentative="1">
+      <w:start w:val="1"/>
+      <w:numFmt w:val="lowerLetter"/>
+      <w:lvlText w:val="%8."/>
+      <w:lvlJc w:val="left"/>
+      <w:pPr>
+        <w:ind w:left="5760" w:hanging="360"/>
+      </w:pPr>
+    </w:lvl>
+    <w:lvl w:ilvl="8" w:tplc="0409001B" w:tentative="1">
+      <w:start w:val="1"/>
+      <w:numFmt w:val="lowerRoman"/>
+      <w:lvlText w:val="%9."/>
+      <w:lvlJc w:val="right"/>
+      <w:pPr>
+        <w:ind w:left="6480" w:hanging="180"/>
+      </w:pPr>
+    </w:lvl>
+  </w:abstractNum>
+  <w:abstractNum w:abstractNumId="5" w15:restartNumberingAfterBreak="0">
     <w:nsid w:val="1A2F2E9E"/>
     <w:multiLevelType w:val="hybridMultilevel"/>
     <w:tmpl w:val="14A683C2"/>
@@ -9928,7 +11783,7 @@
       </w:pPr>
     </w:lvl>
   </w:abstractNum>
-  <w:abstractNum w:abstractNumId="5" w15:restartNumberingAfterBreak="0">
+  <w:abstractNum w:abstractNumId="6" w15:restartNumberingAfterBreak="0">
     <w:nsid w:val="1A9D208D"/>
     <w:multiLevelType w:val="hybridMultilevel"/>
     <w:tmpl w:val="F98653E8"/>
@@ -10041,7 +11896,7 @@
       </w:rPr>
     </w:lvl>
   </w:abstractNum>
-  <w:abstractNum w:abstractNumId="6" w15:restartNumberingAfterBreak="0">
+  <w:abstractNum w:abstractNumId="7" w15:restartNumberingAfterBreak="0">
     <w:nsid w:val="23331E0B"/>
     <w:multiLevelType w:val="hybridMultilevel"/>
     <w:tmpl w:val="7C8C88CC"/>
@@ -10130,7 +11985,7 @@
       </w:pPr>
     </w:lvl>
   </w:abstractNum>
-  <w:abstractNum w:abstractNumId="7" w15:restartNumberingAfterBreak="0">
+  <w:abstractNum w:abstractNumId="8" w15:restartNumberingAfterBreak="0">
     <w:nsid w:val="24FE62D1"/>
     <w:multiLevelType w:val="multilevel"/>
     <w:tmpl w:val="7DE41C80"/>
@@ -10279,7 +12134,7 @@
       </w:rPr>
     </w:lvl>
   </w:abstractNum>
-  <w:abstractNum w:abstractNumId="8" w15:restartNumberingAfterBreak="0">
+  <w:abstractNum w:abstractNumId="9" w15:restartNumberingAfterBreak="0">
     <w:nsid w:val="25060C8A"/>
     <w:multiLevelType w:val="hybridMultilevel"/>
     <w:tmpl w:val="2C6EDBCA"/>
@@ -10392,7 +12247,7 @@
       </w:rPr>
     </w:lvl>
   </w:abstractNum>
-  <w:abstractNum w:abstractNumId="9" w15:restartNumberingAfterBreak="0">
+  <w:abstractNum w:abstractNumId="10" w15:restartNumberingAfterBreak="0">
     <w:nsid w:val="2512601A"/>
     <w:multiLevelType w:val="hybridMultilevel"/>
     <w:tmpl w:val="41945994"/>
@@ -10505,7 +12360,245 @@
       </w:rPr>
     </w:lvl>
   </w:abstractNum>
-  <w:abstractNum w:abstractNumId="10" w15:restartNumberingAfterBreak="0">
+  <w:abstractNum w:abstractNumId="11" w15:restartNumberingAfterBreak="0">
+    <w:nsid w:val="2A692730"/>
+    <w:multiLevelType w:val="multilevel"/>
+    <w:tmpl w:val="27FEB97C"/>
+    <w:lvl w:ilvl="0">
+      <w:start w:val="1"/>
+      <w:numFmt w:val="bullet"/>
+      <w:lvlText w:val=""/>
+      <w:lvlJc w:val="left"/>
+      <w:pPr>
+        <w:tabs>
+          <w:tab w:val="num" w:pos="720"/>
+        </w:tabs>
+        <w:ind w:left="720" w:hanging="360"/>
+      </w:pPr>
+      <w:rPr>
+        <w:rFonts w:ascii="Symbol" w:hAnsi="Symbol" w:hint="default"/>
+        <w:sz w:val="20"/>
+      </w:rPr>
+    </w:lvl>
+    <w:lvl w:ilvl="1" w:tentative="1">
+      <w:start w:val="1"/>
+      <w:numFmt w:val="bullet"/>
+      <w:lvlText w:val="o"/>
+      <w:lvlJc w:val="left"/>
+      <w:pPr>
+        <w:tabs>
+          <w:tab w:val="num" w:pos="1440"/>
+        </w:tabs>
+        <w:ind w:left="1440" w:hanging="360"/>
+      </w:pPr>
+      <w:rPr>
+        <w:rFonts w:ascii="Courier New" w:hAnsi="Courier New" w:hint="default"/>
+        <w:sz w:val="20"/>
+      </w:rPr>
+    </w:lvl>
+    <w:lvl w:ilvl="2" w:tentative="1">
+      <w:start w:val="1"/>
+      <w:numFmt w:val="bullet"/>
+      <w:lvlText w:val=""/>
+      <w:lvlJc w:val="left"/>
+      <w:pPr>
+        <w:tabs>
+          <w:tab w:val="num" w:pos="2160"/>
+        </w:tabs>
+        <w:ind w:left="2160" w:hanging="360"/>
+      </w:pPr>
+      <w:rPr>
+        <w:rFonts w:ascii="Wingdings" w:hAnsi="Wingdings" w:hint="default"/>
+        <w:sz w:val="20"/>
+      </w:rPr>
+    </w:lvl>
+    <w:lvl w:ilvl="3" w:tentative="1">
+      <w:start w:val="1"/>
+      <w:numFmt w:val="bullet"/>
+      <w:lvlText w:val=""/>
+      <w:lvlJc w:val="left"/>
+      <w:pPr>
+        <w:tabs>
+          <w:tab w:val="num" w:pos="2880"/>
+        </w:tabs>
+        <w:ind w:left="2880" w:hanging="360"/>
+      </w:pPr>
+      <w:rPr>
+        <w:rFonts w:ascii="Wingdings" w:hAnsi="Wingdings" w:hint="default"/>
+        <w:sz w:val="20"/>
+      </w:rPr>
+    </w:lvl>
+    <w:lvl w:ilvl="4" w:tentative="1">
+      <w:start w:val="1"/>
+      <w:numFmt w:val="bullet"/>
+      <w:lvlText w:val=""/>
+      <w:lvlJc w:val="left"/>
+      <w:pPr>
+        <w:tabs>
+          <w:tab w:val="num" w:pos="3600"/>
+        </w:tabs>
+        <w:ind w:left="3600" w:hanging="360"/>
+      </w:pPr>
+      <w:rPr>
+        <w:rFonts w:ascii="Wingdings" w:hAnsi="Wingdings" w:hint="default"/>
+        <w:sz w:val="20"/>
+      </w:rPr>
+    </w:lvl>
+    <w:lvl w:ilvl="5" w:tentative="1">
+      <w:start w:val="1"/>
+      <w:numFmt w:val="bullet"/>
+      <w:lvlText w:val=""/>
+      <w:lvlJc w:val="left"/>
+      <w:pPr>
+        <w:tabs>
+          <w:tab w:val="num" w:pos="4320"/>
+        </w:tabs>
+        <w:ind w:left="4320" w:hanging="360"/>
+      </w:pPr>
+      <w:rPr>
+        <w:rFonts w:ascii="Wingdings" w:hAnsi="Wingdings" w:hint="default"/>
+        <w:sz w:val="20"/>
+      </w:rPr>
+    </w:lvl>
+    <w:lvl w:ilvl="6" w:tentative="1">
+      <w:start w:val="1"/>
+      <w:numFmt w:val="bullet"/>
+      <w:lvlText w:val=""/>
+      <w:lvlJc w:val="left"/>
+      <w:pPr>
+        <w:tabs>
+          <w:tab w:val="num" w:pos="5040"/>
+        </w:tabs>
+        <w:ind w:left="5040" w:hanging="360"/>
+      </w:pPr>
+      <w:rPr>
+        <w:rFonts w:ascii="Wingdings" w:hAnsi="Wingdings" w:hint="default"/>
+        <w:sz w:val="20"/>
+      </w:rPr>
+    </w:lvl>
+    <w:lvl w:ilvl="7" w:tentative="1">
+      <w:start w:val="1"/>
+      <w:numFmt w:val="bullet"/>
+      <w:lvlText w:val=""/>
+      <w:lvlJc w:val="left"/>
+      <w:pPr>
+        <w:tabs>
+          <w:tab w:val="num" w:pos="5760"/>
+        </w:tabs>
+        <w:ind w:left="5760" w:hanging="360"/>
+      </w:pPr>
+      <w:rPr>
+        <w:rFonts w:ascii="Wingdings" w:hAnsi="Wingdings" w:hint="default"/>
+        <w:sz w:val="20"/>
+      </w:rPr>
+    </w:lvl>
+    <w:lvl w:ilvl="8" w:tentative="1">
+      <w:start w:val="1"/>
+      <w:numFmt w:val="bullet"/>
+      <w:lvlText w:val=""/>
+      <w:lvlJc w:val="left"/>
+      <w:pPr>
+        <w:tabs>
+          <w:tab w:val="num" w:pos="6480"/>
+        </w:tabs>
+        <w:ind w:left="6480" w:hanging="360"/>
+      </w:pPr>
+      <w:rPr>
+        <w:rFonts w:ascii="Wingdings" w:hAnsi="Wingdings" w:hint="default"/>
+        <w:sz w:val="20"/>
+      </w:rPr>
+    </w:lvl>
+  </w:abstractNum>
+  <w:abstractNum w:abstractNumId="12" w15:restartNumberingAfterBreak="0">
+    <w:nsid w:val="2DB47C09"/>
+    <w:multiLevelType w:val="hybridMultilevel"/>
+    <w:tmpl w:val="EF46FBE4"/>
+    <w:lvl w:ilvl="0" w:tplc="0409000F">
+      <w:start w:val="1"/>
+      <w:numFmt w:val="decimal"/>
+      <w:lvlText w:val="%1."/>
+      <w:lvlJc w:val="left"/>
+      <w:pPr>
+        <w:ind w:left="720" w:hanging="360"/>
+      </w:pPr>
+      <w:rPr>
+        <w:rFonts w:hint="default"/>
+      </w:rPr>
+    </w:lvl>
+    <w:lvl w:ilvl="1" w:tplc="04090019" w:tentative="1">
+      <w:start w:val="1"/>
+      <w:numFmt w:val="lowerLetter"/>
+      <w:lvlText w:val="%2."/>
+      <w:lvlJc w:val="left"/>
+      <w:pPr>
+        <w:ind w:left="1440" w:hanging="360"/>
+      </w:pPr>
+    </w:lvl>
+    <w:lvl w:ilvl="2" w:tplc="0409001B" w:tentative="1">
+      <w:start w:val="1"/>
+      <w:numFmt w:val="lowerRoman"/>
+      <w:lvlText w:val="%3."/>
+      <w:lvlJc w:val="right"/>
+      <w:pPr>
+        <w:ind w:left="2160" w:hanging="180"/>
+      </w:pPr>
+    </w:lvl>
+    <w:lvl w:ilvl="3" w:tplc="0409000F" w:tentative="1">
+      <w:start w:val="1"/>
+      <w:numFmt w:val="decimal"/>
+      <w:lvlText w:val="%4."/>
+      <w:lvlJc w:val="left"/>
+      <w:pPr>
+        <w:ind w:left="2880" w:hanging="360"/>
+      </w:pPr>
+    </w:lvl>
+    <w:lvl w:ilvl="4" w:tplc="04090019" w:tentative="1">
+      <w:start w:val="1"/>
+      <w:numFmt w:val="lowerLetter"/>
+      <w:lvlText w:val="%5."/>
+      <w:lvlJc w:val="left"/>
+      <w:pPr>
+        <w:ind w:left="3600" w:hanging="360"/>
+      </w:pPr>
+    </w:lvl>
+    <w:lvl w:ilvl="5" w:tplc="0409001B" w:tentative="1">
+      <w:start w:val="1"/>
+      <w:numFmt w:val="lowerRoman"/>
+      <w:lvlText w:val="%6."/>
+      <w:lvlJc w:val="right"/>
+      <w:pPr>
+        <w:ind w:left="4320" w:hanging="180"/>
+      </w:pPr>
+    </w:lvl>
+    <w:lvl w:ilvl="6" w:tplc="0409000F" w:tentative="1">
+      <w:start w:val="1"/>
+      <w:numFmt w:val="decimal"/>
+      <w:lvlText w:val="%7."/>
+      <w:lvlJc w:val="left"/>
+      <w:pPr>
+        <w:ind w:left="5040" w:hanging="360"/>
+      </w:pPr>
+    </w:lvl>
+    <w:lvl w:ilvl="7" w:tplc="04090019" w:tentative="1">
+      <w:start w:val="1"/>
+      <w:numFmt w:val="lowerLetter"/>
+      <w:lvlText w:val="%8."/>
+      <w:lvlJc w:val="left"/>
+      <w:pPr>
+        <w:ind w:left="5760" w:hanging="360"/>
+      </w:pPr>
+    </w:lvl>
+    <w:lvl w:ilvl="8" w:tplc="0409001B" w:tentative="1">
+      <w:start w:val="1"/>
+      <w:numFmt w:val="lowerRoman"/>
+      <w:lvlText w:val="%9."/>
+      <w:lvlJc w:val="right"/>
+      <w:pPr>
+        <w:ind w:left="6480" w:hanging="180"/>
+      </w:pPr>
+    </w:lvl>
+  </w:abstractNum>
+  <w:abstractNum w:abstractNumId="13" w15:restartNumberingAfterBreak="0">
     <w:nsid w:val="338C4ADF"/>
     <w:multiLevelType w:val="hybridMultilevel"/>
     <w:tmpl w:val="8EF029A2"/>
@@ -10618,7 +12711,7 @@
       </w:rPr>
     </w:lvl>
   </w:abstractNum>
-  <w:abstractNum w:abstractNumId="11" w15:restartNumberingAfterBreak="0">
+  <w:abstractNum w:abstractNumId="14" w15:restartNumberingAfterBreak="0">
     <w:nsid w:val="34C06837"/>
     <w:multiLevelType w:val="hybridMultilevel"/>
     <w:tmpl w:val="0ABC07B6"/>
@@ -10707,7 +12800,7 @@
       </w:pPr>
     </w:lvl>
   </w:abstractNum>
-  <w:abstractNum w:abstractNumId="12" w15:restartNumberingAfterBreak="0">
+  <w:abstractNum w:abstractNumId="15" w15:restartNumberingAfterBreak="0">
     <w:nsid w:val="362618FD"/>
     <w:multiLevelType w:val="hybridMultilevel"/>
     <w:tmpl w:val="25048DF0"/>
@@ -10796,7 +12889,7 @@
       </w:pPr>
     </w:lvl>
   </w:abstractNum>
-  <w:abstractNum w:abstractNumId="13" w15:restartNumberingAfterBreak="0">
+  <w:abstractNum w:abstractNumId="16" w15:restartNumberingAfterBreak="0">
     <w:nsid w:val="390818AD"/>
     <w:multiLevelType w:val="multilevel"/>
     <w:tmpl w:val="BBC4CF78"/>
@@ -10945,7 +13038,7 @@
       </w:rPr>
     </w:lvl>
   </w:abstractNum>
-  <w:abstractNum w:abstractNumId="14" w15:restartNumberingAfterBreak="0">
+  <w:abstractNum w:abstractNumId="17" w15:restartNumberingAfterBreak="0">
     <w:nsid w:val="39C2195B"/>
     <w:multiLevelType w:val="hybridMultilevel"/>
     <w:tmpl w:val="E52EA3AA"/>
@@ -11034,7 +13127,7 @@
       </w:pPr>
     </w:lvl>
   </w:abstractNum>
-  <w:abstractNum w:abstractNumId="15" w15:restartNumberingAfterBreak="0">
+  <w:abstractNum w:abstractNumId="18" w15:restartNumberingAfterBreak="0">
     <w:nsid w:val="3CB23B7C"/>
     <w:multiLevelType w:val="hybridMultilevel"/>
     <w:tmpl w:val="56B6FDD0"/>
@@ -11123,7 +13216,7 @@
       </w:pPr>
     </w:lvl>
   </w:abstractNum>
-  <w:abstractNum w:abstractNumId="16" w15:restartNumberingAfterBreak="0">
+  <w:abstractNum w:abstractNumId="19" w15:restartNumberingAfterBreak="0">
     <w:nsid w:val="3EFA482A"/>
     <w:multiLevelType w:val="hybridMultilevel"/>
     <w:tmpl w:val="534CFAC8"/>
@@ -11236,7 +13329,7 @@
       </w:rPr>
     </w:lvl>
   </w:abstractNum>
-  <w:abstractNum w:abstractNumId="17" w15:restartNumberingAfterBreak="0">
+  <w:abstractNum w:abstractNumId="20" w15:restartNumberingAfterBreak="0">
     <w:nsid w:val="3F8E6D88"/>
     <w:multiLevelType w:val="hybridMultilevel"/>
     <w:tmpl w:val="0EC28FD8"/>
@@ -11349,7 +13442,7 @@
       </w:rPr>
     </w:lvl>
   </w:abstractNum>
-  <w:abstractNum w:abstractNumId="18" w15:restartNumberingAfterBreak="0">
+  <w:abstractNum w:abstractNumId="21" w15:restartNumberingAfterBreak="0">
     <w:nsid w:val="3FC22C48"/>
     <w:multiLevelType w:val="hybridMultilevel"/>
     <w:tmpl w:val="945ADEB8"/>
@@ -11462,7 +13555,7 @@
       </w:rPr>
     </w:lvl>
   </w:abstractNum>
-  <w:abstractNum w:abstractNumId="19" w15:restartNumberingAfterBreak="0">
+  <w:abstractNum w:abstractNumId="22" w15:restartNumberingAfterBreak="0">
     <w:nsid w:val="41A8120A"/>
     <w:multiLevelType w:val="hybridMultilevel"/>
     <w:tmpl w:val="79EAA8B4"/>
@@ -11575,7 +13668,7 @@
       </w:rPr>
     </w:lvl>
   </w:abstractNum>
-  <w:abstractNum w:abstractNumId="20" w15:restartNumberingAfterBreak="0">
+  <w:abstractNum w:abstractNumId="23" w15:restartNumberingAfterBreak="0">
     <w:nsid w:val="48F47C8A"/>
     <w:multiLevelType w:val="hybridMultilevel"/>
     <w:tmpl w:val="7C8C88CC"/>
@@ -11664,7 +13757,7 @@
       </w:pPr>
     </w:lvl>
   </w:abstractNum>
-  <w:abstractNum w:abstractNumId="21" w15:restartNumberingAfterBreak="0">
+  <w:abstractNum w:abstractNumId="24" w15:restartNumberingAfterBreak="0">
     <w:nsid w:val="5233488E"/>
     <w:multiLevelType w:val="hybridMultilevel"/>
     <w:tmpl w:val="0BB0CCF4"/>
@@ -11777,7 +13870,156 @@
       </w:rPr>
     </w:lvl>
   </w:abstractNum>
-  <w:abstractNum w:abstractNumId="22" w15:restartNumberingAfterBreak="0">
+  <w:abstractNum w:abstractNumId="25" w15:restartNumberingAfterBreak="0">
+    <w:nsid w:val="52427CDF"/>
+    <w:multiLevelType w:val="multilevel"/>
+    <w:tmpl w:val="71EE2378"/>
+    <w:lvl w:ilvl="0">
+      <w:start w:val="1"/>
+      <w:numFmt w:val="bullet"/>
+      <w:lvlText w:val=""/>
+      <w:lvlJc w:val="left"/>
+      <w:pPr>
+        <w:tabs>
+          <w:tab w:val="num" w:pos="720"/>
+        </w:tabs>
+        <w:ind w:left="720" w:hanging="360"/>
+      </w:pPr>
+      <w:rPr>
+        <w:rFonts w:ascii="Symbol" w:hAnsi="Symbol" w:hint="default"/>
+        <w:sz w:val="20"/>
+      </w:rPr>
+    </w:lvl>
+    <w:lvl w:ilvl="1" w:tentative="1">
+      <w:start w:val="1"/>
+      <w:numFmt w:val="bullet"/>
+      <w:lvlText w:val="o"/>
+      <w:lvlJc w:val="left"/>
+      <w:pPr>
+        <w:tabs>
+          <w:tab w:val="num" w:pos="1440"/>
+        </w:tabs>
+        <w:ind w:left="1440" w:hanging="360"/>
+      </w:pPr>
+      <w:rPr>
+        <w:rFonts w:ascii="Courier New" w:hAnsi="Courier New" w:hint="default"/>
+        <w:sz w:val="20"/>
+      </w:rPr>
+    </w:lvl>
+    <w:lvl w:ilvl="2" w:tentative="1">
+      <w:start w:val="1"/>
+      <w:numFmt w:val="bullet"/>
+      <w:lvlText w:val=""/>
+      <w:lvlJc w:val="left"/>
+      <w:pPr>
+        <w:tabs>
+          <w:tab w:val="num" w:pos="2160"/>
+        </w:tabs>
+        <w:ind w:left="2160" w:hanging="360"/>
+      </w:pPr>
+      <w:rPr>
+        <w:rFonts w:ascii="Wingdings" w:hAnsi="Wingdings" w:hint="default"/>
+        <w:sz w:val="20"/>
+      </w:rPr>
+    </w:lvl>
+    <w:lvl w:ilvl="3" w:tentative="1">
+      <w:start w:val="1"/>
+      <w:numFmt w:val="bullet"/>
+      <w:lvlText w:val=""/>
+      <w:lvlJc w:val="left"/>
+      <w:pPr>
+        <w:tabs>
+          <w:tab w:val="num" w:pos="2880"/>
+        </w:tabs>
+        <w:ind w:left="2880" w:hanging="360"/>
+      </w:pPr>
+      <w:rPr>
+        <w:rFonts w:ascii="Wingdings" w:hAnsi="Wingdings" w:hint="default"/>
+        <w:sz w:val="20"/>
+      </w:rPr>
+    </w:lvl>
+    <w:lvl w:ilvl="4" w:tentative="1">
+      <w:start w:val="1"/>
+      <w:numFmt w:val="bullet"/>
+      <w:lvlText w:val=""/>
+      <w:lvlJc w:val="left"/>
+      <w:pPr>
+        <w:tabs>
+          <w:tab w:val="num" w:pos="3600"/>
+        </w:tabs>
+        <w:ind w:left="3600" w:hanging="360"/>
+      </w:pPr>
+      <w:rPr>
+        <w:rFonts w:ascii="Wingdings" w:hAnsi="Wingdings" w:hint="default"/>
+        <w:sz w:val="20"/>
+      </w:rPr>
+    </w:lvl>
+    <w:lvl w:ilvl="5" w:tentative="1">
+      <w:start w:val="1"/>
+      <w:numFmt w:val="bullet"/>
+      <w:lvlText w:val=""/>
+      <w:lvlJc w:val="left"/>
+      <w:pPr>
+        <w:tabs>
+          <w:tab w:val="num" w:pos="4320"/>
+        </w:tabs>
+        <w:ind w:left="4320" w:hanging="360"/>
+      </w:pPr>
+      <w:rPr>
+        <w:rFonts w:ascii="Wingdings" w:hAnsi="Wingdings" w:hint="default"/>
+        <w:sz w:val="20"/>
+      </w:rPr>
+    </w:lvl>
+    <w:lvl w:ilvl="6" w:tentative="1">
+      <w:start w:val="1"/>
+      <w:numFmt w:val="bullet"/>
+      <w:lvlText w:val=""/>
+      <w:lvlJc w:val="left"/>
+      <w:pPr>
+        <w:tabs>
+          <w:tab w:val="num" w:pos="5040"/>
+        </w:tabs>
+        <w:ind w:left="5040" w:hanging="360"/>
+      </w:pPr>
+      <w:rPr>
+        <w:rFonts w:ascii="Wingdings" w:hAnsi="Wingdings" w:hint="default"/>
+        <w:sz w:val="20"/>
+      </w:rPr>
+    </w:lvl>
+    <w:lvl w:ilvl="7" w:tentative="1">
+      <w:start w:val="1"/>
+      <w:numFmt w:val="bullet"/>
+      <w:lvlText w:val=""/>
+      <w:lvlJc w:val="left"/>
+      <w:pPr>
+        <w:tabs>
+          <w:tab w:val="num" w:pos="5760"/>
+        </w:tabs>
+        <w:ind w:left="5760" w:hanging="360"/>
+      </w:pPr>
+      <w:rPr>
+        <w:rFonts w:ascii="Wingdings" w:hAnsi="Wingdings" w:hint="default"/>
+        <w:sz w:val="20"/>
+      </w:rPr>
+    </w:lvl>
+    <w:lvl w:ilvl="8" w:tentative="1">
+      <w:start w:val="1"/>
+      <w:numFmt w:val="bullet"/>
+      <w:lvlText w:val=""/>
+      <w:lvlJc w:val="left"/>
+      <w:pPr>
+        <w:tabs>
+          <w:tab w:val="num" w:pos="6480"/>
+        </w:tabs>
+        <w:ind w:left="6480" w:hanging="360"/>
+      </w:pPr>
+      <w:rPr>
+        <w:rFonts w:ascii="Wingdings" w:hAnsi="Wingdings" w:hint="default"/>
+        <w:sz w:val="20"/>
+      </w:rPr>
+    </w:lvl>
+  </w:abstractNum>
+  <w:abstractNum w:abstractNumId="26" w15:restartNumberingAfterBreak="0">
     <w:nsid w:val="52AD73CF"/>
     <w:multiLevelType w:val="hybridMultilevel"/>
     <w:tmpl w:val="5DF88AA0"/>
@@ -11890,7 +14132,96 @@
       </w:rPr>
     </w:lvl>
   </w:abstractNum>
-  <w:abstractNum w:abstractNumId="23" w15:restartNumberingAfterBreak="0">
+  <w:abstractNum w:abstractNumId="27" w15:restartNumberingAfterBreak="0">
+    <w:nsid w:val="53F1008D"/>
+    <w:multiLevelType w:val="hybridMultilevel"/>
+    <w:tmpl w:val="601C7BB0"/>
+    <w:lvl w:ilvl="0" w:tplc="FFFFFFFF">
+      <w:start w:val="1"/>
+      <w:numFmt w:val="decimal"/>
+      <w:lvlText w:val="%1."/>
+      <w:lvlJc w:val="left"/>
+      <w:pPr>
+        <w:ind w:left="720" w:hanging="360"/>
+      </w:pPr>
+      <w:rPr>
+        <w:rFonts w:hint="default"/>
+      </w:rPr>
+    </w:lvl>
+    <w:lvl w:ilvl="1" w:tplc="FFFFFFFF" w:tentative="1">
+      <w:start w:val="1"/>
+      <w:numFmt w:val="lowerLetter"/>
+      <w:lvlText w:val="%2."/>
+      <w:lvlJc w:val="left"/>
+      <w:pPr>
+        <w:ind w:left="1440" w:hanging="360"/>
+      </w:pPr>
+    </w:lvl>
+    <w:lvl w:ilvl="2" w:tplc="FFFFFFFF" w:tentative="1">
+      <w:start w:val="1"/>
+      <w:numFmt w:val="lowerRoman"/>
+      <w:lvlText w:val="%3."/>
+      <w:lvlJc w:val="right"/>
+      <w:pPr>
+        <w:ind w:left="2160" w:hanging="180"/>
+      </w:pPr>
+    </w:lvl>
+    <w:lvl w:ilvl="3" w:tplc="FFFFFFFF" w:tentative="1">
+      <w:start w:val="1"/>
+      <w:numFmt w:val="decimal"/>
+      <w:lvlText w:val="%4."/>
+      <w:lvlJc w:val="left"/>
+      <w:pPr>
+        <w:ind w:left="2880" w:hanging="360"/>
+      </w:pPr>
+    </w:lvl>
+    <w:lvl w:ilvl="4" w:tplc="FFFFFFFF" w:tentative="1">
+      <w:start w:val="1"/>
+      <w:numFmt w:val="lowerLetter"/>
+      <w:lvlText w:val="%5."/>
+      <w:lvlJc w:val="left"/>
+      <w:pPr>
+        <w:ind w:left="3600" w:hanging="360"/>
+      </w:pPr>
+    </w:lvl>
+    <w:lvl w:ilvl="5" w:tplc="FFFFFFFF" w:tentative="1">
+      <w:start w:val="1"/>
+      <w:numFmt w:val="lowerRoman"/>
+      <w:lvlText w:val="%6."/>
+      <w:lvlJc w:val="right"/>
+      <w:pPr>
+        <w:ind w:left="4320" w:hanging="180"/>
+      </w:pPr>
+    </w:lvl>
+    <w:lvl w:ilvl="6" w:tplc="FFFFFFFF" w:tentative="1">
+      <w:start w:val="1"/>
+      <w:numFmt w:val="decimal"/>
+      <w:lvlText w:val="%7."/>
+      <w:lvlJc w:val="left"/>
+      <w:pPr>
+        <w:ind w:left="5040" w:hanging="360"/>
+      </w:pPr>
+    </w:lvl>
+    <w:lvl w:ilvl="7" w:tplc="FFFFFFFF" w:tentative="1">
+      <w:start w:val="1"/>
+      <w:numFmt w:val="lowerLetter"/>
+      <w:lvlText w:val="%8."/>
+      <w:lvlJc w:val="left"/>
+      <w:pPr>
+        <w:ind w:left="5760" w:hanging="360"/>
+      </w:pPr>
+    </w:lvl>
+    <w:lvl w:ilvl="8" w:tplc="FFFFFFFF" w:tentative="1">
+      <w:start w:val="1"/>
+      <w:numFmt w:val="lowerRoman"/>
+      <w:lvlText w:val="%9."/>
+      <w:lvlJc w:val="right"/>
+      <w:pPr>
+        <w:ind w:left="6480" w:hanging="180"/>
+      </w:pPr>
+    </w:lvl>
+  </w:abstractNum>
+  <w:abstractNum w:abstractNumId="28" w15:restartNumberingAfterBreak="0">
     <w:nsid w:val="54DD7404"/>
     <w:multiLevelType w:val="hybridMultilevel"/>
     <w:tmpl w:val="A712F55E"/>
@@ -11979,7 +14310,7 @@
       </w:pPr>
     </w:lvl>
   </w:abstractNum>
-  <w:abstractNum w:abstractNumId="24" w15:restartNumberingAfterBreak="0">
+  <w:abstractNum w:abstractNumId="29" w15:restartNumberingAfterBreak="0">
     <w:nsid w:val="557F35CD"/>
     <w:multiLevelType w:val="hybridMultilevel"/>
     <w:tmpl w:val="34446634"/>
@@ -12092,7 +14423,7 @@
       </w:rPr>
     </w:lvl>
   </w:abstractNum>
-  <w:abstractNum w:abstractNumId="25" w15:restartNumberingAfterBreak="0">
+  <w:abstractNum w:abstractNumId="30" w15:restartNumberingAfterBreak="0">
     <w:nsid w:val="55847672"/>
     <w:multiLevelType w:val="hybridMultilevel"/>
     <w:tmpl w:val="A5043578"/>
@@ -12205,7 +14536,7 @@
       </w:rPr>
     </w:lvl>
   </w:abstractNum>
-  <w:abstractNum w:abstractNumId="26" w15:restartNumberingAfterBreak="0">
+  <w:abstractNum w:abstractNumId="31" w15:restartNumberingAfterBreak="0">
     <w:nsid w:val="604B653A"/>
     <w:multiLevelType w:val="hybridMultilevel"/>
     <w:tmpl w:val="6E3C7EB2"/>
@@ -12318,7 +14649,7 @@
       </w:rPr>
     </w:lvl>
   </w:abstractNum>
-  <w:abstractNum w:abstractNumId="27" w15:restartNumberingAfterBreak="0">
+  <w:abstractNum w:abstractNumId="32" w15:restartNumberingAfterBreak="0">
     <w:nsid w:val="631A189A"/>
     <w:multiLevelType w:val="hybridMultilevel"/>
     <w:tmpl w:val="01BA73BA"/>
@@ -12431,7 +14762,7 @@
       </w:rPr>
     </w:lvl>
   </w:abstractNum>
-  <w:abstractNum w:abstractNumId="28" w15:restartNumberingAfterBreak="0">
+  <w:abstractNum w:abstractNumId="33" w15:restartNumberingAfterBreak="0">
     <w:nsid w:val="63B55B84"/>
     <w:multiLevelType w:val="hybridMultilevel"/>
     <w:tmpl w:val="55644DAC"/>
@@ -12544,7 +14875,7 @@
       </w:rPr>
     </w:lvl>
   </w:abstractNum>
-  <w:abstractNum w:abstractNumId="29" w15:restartNumberingAfterBreak="0">
+  <w:abstractNum w:abstractNumId="34" w15:restartNumberingAfterBreak="0">
     <w:nsid w:val="63DD5C33"/>
     <w:multiLevelType w:val="hybridMultilevel"/>
     <w:tmpl w:val="53B0F74E"/>
@@ -12657,7 +14988,7 @@
       </w:rPr>
     </w:lvl>
   </w:abstractNum>
-  <w:abstractNum w:abstractNumId="30" w15:restartNumberingAfterBreak="0">
+  <w:abstractNum w:abstractNumId="35" w15:restartNumberingAfterBreak="0">
     <w:nsid w:val="70E01891"/>
     <w:multiLevelType w:val="hybridMultilevel"/>
     <w:tmpl w:val="BD9C9256"/>
@@ -12770,7 +15101,7 @@
       </w:rPr>
     </w:lvl>
   </w:abstractNum>
-  <w:abstractNum w:abstractNumId="31" w15:restartNumberingAfterBreak="0">
+  <w:abstractNum w:abstractNumId="36" w15:restartNumberingAfterBreak="0">
     <w:nsid w:val="722C614F"/>
     <w:multiLevelType w:val="hybridMultilevel"/>
     <w:tmpl w:val="6F3A86E6"/>
@@ -12884,7 +15215,7 @@
       </w:rPr>
     </w:lvl>
   </w:abstractNum>
-  <w:abstractNum w:abstractNumId="32" w15:restartNumberingAfterBreak="0">
+  <w:abstractNum w:abstractNumId="37" w15:restartNumberingAfterBreak="0">
     <w:nsid w:val="75201500"/>
     <w:multiLevelType w:val="hybridMultilevel"/>
     <w:tmpl w:val="88A498EE"/>
@@ -12973,7 +15304,7 @@
       </w:pPr>
     </w:lvl>
   </w:abstractNum>
-  <w:abstractNum w:abstractNumId="33" w15:restartNumberingAfterBreak="0">
+  <w:abstractNum w:abstractNumId="38" w15:restartNumberingAfterBreak="0">
     <w:nsid w:val="753B3BBC"/>
     <w:multiLevelType w:val="hybridMultilevel"/>
     <w:tmpl w:val="377CFCAE"/>
@@ -13062,7 +15393,96 @@
       </w:pPr>
     </w:lvl>
   </w:abstractNum>
-  <w:abstractNum w:abstractNumId="34" w15:restartNumberingAfterBreak="0">
+  <w:abstractNum w:abstractNumId="39" w15:restartNumberingAfterBreak="0">
+    <w:nsid w:val="7C2B4096"/>
+    <w:multiLevelType w:val="hybridMultilevel"/>
+    <w:tmpl w:val="601C7BB0"/>
+    <w:lvl w:ilvl="0" w:tplc="0409000F">
+      <w:start w:val="1"/>
+      <w:numFmt w:val="decimal"/>
+      <w:lvlText w:val="%1."/>
+      <w:lvlJc w:val="left"/>
+      <w:pPr>
+        <w:ind w:left="720" w:hanging="360"/>
+      </w:pPr>
+      <w:rPr>
+        <w:rFonts w:hint="default"/>
+      </w:rPr>
+    </w:lvl>
+    <w:lvl w:ilvl="1" w:tplc="04090019" w:tentative="1">
+      <w:start w:val="1"/>
+      <w:numFmt w:val="lowerLetter"/>
+      <w:lvlText w:val="%2."/>
+      <w:lvlJc w:val="left"/>
+      <w:pPr>
+        <w:ind w:left="1440" w:hanging="360"/>
+      </w:pPr>
+    </w:lvl>
+    <w:lvl w:ilvl="2" w:tplc="0409001B" w:tentative="1">
+      <w:start w:val="1"/>
+      <w:numFmt w:val="lowerRoman"/>
+      <w:lvlText w:val="%3."/>
+      <w:lvlJc w:val="right"/>
+      <w:pPr>
+        <w:ind w:left="2160" w:hanging="180"/>
+      </w:pPr>
+    </w:lvl>
+    <w:lvl w:ilvl="3" w:tplc="0409000F" w:tentative="1">
+      <w:start w:val="1"/>
+      <w:numFmt w:val="decimal"/>
+      <w:lvlText w:val="%4."/>
+      <w:lvlJc w:val="left"/>
+      <w:pPr>
+        <w:ind w:left="2880" w:hanging="360"/>
+      </w:pPr>
+    </w:lvl>
+    <w:lvl w:ilvl="4" w:tplc="04090019" w:tentative="1">
+      <w:start w:val="1"/>
+      <w:numFmt w:val="lowerLetter"/>
+      <w:lvlText w:val="%5."/>
+      <w:lvlJc w:val="left"/>
+      <w:pPr>
+        <w:ind w:left="3600" w:hanging="360"/>
+      </w:pPr>
+    </w:lvl>
+    <w:lvl w:ilvl="5" w:tplc="0409001B" w:tentative="1">
+      <w:start w:val="1"/>
+      <w:numFmt w:val="lowerRoman"/>
+      <w:lvlText w:val="%6."/>
+      <w:lvlJc w:val="right"/>
+      <w:pPr>
+        <w:ind w:left="4320" w:hanging="180"/>
+      </w:pPr>
+    </w:lvl>
+    <w:lvl w:ilvl="6" w:tplc="0409000F" w:tentative="1">
+      <w:start w:val="1"/>
+      <w:numFmt w:val="decimal"/>
+      <w:lvlText w:val="%7."/>
+      <w:lvlJc w:val="left"/>
+      <w:pPr>
+        <w:ind w:left="5040" w:hanging="360"/>
+      </w:pPr>
+    </w:lvl>
+    <w:lvl w:ilvl="7" w:tplc="04090019" w:tentative="1">
+      <w:start w:val="1"/>
+      <w:numFmt w:val="lowerLetter"/>
+      <w:lvlText w:val="%8."/>
+      <w:lvlJc w:val="left"/>
+      <w:pPr>
+        <w:ind w:left="5760" w:hanging="360"/>
+      </w:pPr>
+    </w:lvl>
+    <w:lvl w:ilvl="8" w:tplc="0409001B" w:tentative="1">
+      <w:start w:val="1"/>
+      <w:numFmt w:val="lowerRoman"/>
+      <w:lvlText w:val="%9."/>
+      <w:lvlJc w:val="right"/>
+      <w:pPr>
+        <w:ind w:left="6480" w:hanging="180"/>
+      </w:pPr>
+    </w:lvl>
+  </w:abstractNum>
+  <w:abstractNum w:abstractNumId="40" w15:restartNumberingAfterBreak="0">
     <w:nsid w:val="7FA10FC0"/>
     <w:multiLevelType w:val="multilevel"/>
     <w:tmpl w:val="E2C67DE8"/>
@@ -13212,109 +15632,127 @@
     </w:lvl>
   </w:abstractNum>
   <w:num w:numId="1" w16cid:durableId="1812401953">
-    <w:abstractNumId w:val="5"/>
+    <w:abstractNumId w:val="6"/>
   </w:num>
   <w:num w:numId="2" w16cid:durableId="206917160">
+    <w:abstractNumId w:val="10"/>
+  </w:num>
+  <w:num w:numId="3" w16cid:durableId="48497325">
+    <w:abstractNumId w:val="29"/>
+  </w:num>
+  <w:num w:numId="4" w16cid:durableId="869345188">
     <w:abstractNumId w:val="9"/>
   </w:num>
-  <w:num w:numId="3" w16cid:durableId="48497325">
-    <w:abstractNumId w:val="24"/>
-  </w:num>
-  <w:num w:numId="4" w16cid:durableId="869345188">
-    <w:abstractNumId w:val="8"/>
-  </w:num>
   <w:num w:numId="5" w16cid:durableId="1881672685">
-    <w:abstractNumId w:val="20"/>
+    <w:abstractNumId w:val="23"/>
   </w:num>
   <w:num w:numId="6" w16cid:durableId="1430469929">
-    <w:abstractNumId w:val="6"/>
+    <w:abstractNumId w:val="7"/>
   </w:num>
   <w:num w:numId="7" w16cid:durableId="450781648">
-    <w:abstractNumId w:val="32"/>
+    <w:abstractNumId w:val="37"/>
   </w:num>
   <w:num w:numId="8" w16cid:durableId="1857422635">
     <w:abstractNumId w:val="3"/>
   </w:num>
   <w:num w:numId="9" w16cid:durableId="2141416700">
+    <w:abstractNumId w:val="24"/>
+  </w:num>
+  <w:num w:numId="10" w16cid:durableId="1898273047">
     <w:abstractNumId w:val="21"/>
   </w:num>
-  <w:num w:numId="10" w16cid:durableId="1898273047">
-    <w:abstractNumId w:val="18"/>
-  </w:num>
   <w:num w:numId="11" w16cid:durableId="1171988897">
-    <w:abstractNumId w:val="26"/>
+    <w:abstractNumId w:val="31"/>
   </w:num>
   <w:num w:numId="12" w16cid:durableId="747312105">
-    <w:abstractNumId w:val="11"/>
+    <w:abstractNumId w:val="14"/>
   </w:num>
   <w:num w:numId="13" w16cid:durableId="1478885573">
-    <w:abstractNumId w:val="34"/>
+    <w:abstractNumId w:val="40"/>
   </w:num>
   <w:num w:numId="14" w16cid:durableId="1524856681">
-    <w:abstractNumId w:val="13"/>
+    <w:abstractNumId w:val="16"/>
   </w:num>
   <w:num w:numId="15" w16cid:durableId="1193300417">
     <w:abstractNumId w:val="2"/>
   </w:num>
   <w:num w:numId="16" w16cid:durableId="2012490252">
-    <w:abstractNumId w:val="12"/>
+    <w:abstractNumId w:val="15"/>
   </w:num>
   <w:num w:numId="17" w16cid:durableId="1778714404">
-    <w:abstractNumId w:val="29"/>
+    <w:abstractNumId w:val="34"/>
   </w:num>
   <w:num w:numId="18" w16cid:durableId="1264805506">
     <w:abstractNumId w:val="0"/>
   </w:num>
   <w:num w:numId="19" w16cid:durableId="867375049">
-    <w:abstractNumId w:val="16"/>
+    <w:abstractNumId w:val="19"/>
   </w:num>
   <w:num w:numId="20" w16cid:durableId="1543594277">
-    <w:abstractNumId w:val="17"/>
+    <w:abstractNumId w:val="20"/>
   </w:num>
   <w:num w:numId="21" w16cid:durableId="562764955">
-    <w:abstractNumId w:val="4"/>
+    <w:abstractNumId w:val="5"/>
   </w:num>
   <w:num w:numId="22" w16cid:durableId="979962572">
-    <w:abstractNumId w:val="25"/>
+    <w:abstractNumId w:val="30"/>
   </w:num>
   <w:num w:numId="23" w16cid:durableId="281495048">
-    <w:abstractNumId w:val="27"/>
+    <w:abstractNumId w:val="32"/>
   </w:num>
   <w:num w:numId="24" w16cid:durableId="1338119324">
-    <w:abstractNumId w:val="7"/>
+    <w:abstractNumId w:val="8"/>
   </w:num>
   <w:num w:numId="25" w16cid:durableId="309023156">
-    <w:abstractNumId w:val="14"/>
+    <w:abstractNumId w:val="17"/>
   </w:num>
   <w:num w:numId="26" w16cid:durableId="998657042">
     <w:abstractNumId w:val="1"/>
   </w:num>
   <w:num w:numId="27" w16cid:durableId="1218668832">
-    <w:abstractNumId w:val="10"/>
+    <w:abstractNumId w:val="13"/>
   </w:num>
   <w:num w:numId="28" w16cid:durableId="1667706333">
-    <w:abstractNumId w:val="19"/>
+    <w:abstractNumId w:val="22"/>
   </w:num>
   <w:num w:numId="29" w16cid:durableId="1097752994">
-    <w:abstractNumId w:val="22"/>
+    <w:abstractNumId w:val="26"/>
   </w:num>
   <w:num w:numId="30" w16cid:durableId="1956600213">
+    <w:abstractNumId w:val="33"/>
+  </w:num>
+  <w:num w:numId="31" w16cid:durableId="1884751401">
+    <w:abstractNumId w:val="35"/>
+  </w:num>
+  <w:num w:numId="32" w16cid:durableId="1285842554">
+    <w:abstractNumId w:val="38"/>
+  </w:num>
+  <w:num w:numId="33" w16cid:durableId="64112966">
     <w:abstractNumId w:val="28"/>
   </w:num>
-  <w:num w:numId="31" w16cid:durableId="1884751401">
-    <w:abstractNumId w:val="30"/>
-  </w:num>
-  <w:num w:numId="32" w16cid:durableId="1285842554">
-    <w:abstractNumId w:val="33"/>
-  </w:num>
-  <w:num w:numId="33" w16cid:durableId="64112966">
-    <w:abstractNumId w:val="23"/>
-  </w:num>
   <w:num w:numId="34" w16cid:durableId="967317335">
-    <w:abstractNumId w:val="15"/>
+    <w:abstractNumId w:val="18"/>
   </w:num>
   <w:num w:numId="35" w16cid:durableId="1839955413">
-    <w:abstractNumId w:val="31"/>
+    <w:abstractNumId w:val="36"/>
+  </w:num>
+  <w:num w:numId="36" w16cid:durableId="597717164">
+    <w:abstractNumId w:val="11"/>
+  </w:num>
+  <w:num w:numId="37" w16cid:durableId="504588303">
+    <w:abstractNumId w:val="25"/>
+  </w:num>
+  <w:num w:numId="38" w16cid:durableId="884829888">
+    <w:abstractNumId w:val="4"/>
+  </w:num>
+  <w:num w:numId="39" w16cid:durableId="1240141738">
+    <w:abstractNumId w:val="39"/>
+  </w:num>
+  <w:num w:numId="40" w16cid:durableId="1387683402">
+    <w:abstractNumId w:val="27"/>
+  </w:num>
+  <w:num w:numId="41" w16cid:durableId="1078282691">
+    <w:abstractNumId w:val="12"/>
   </w:num>
 </w:numbering>
 </file>
@@ -14496,6 +16934,29 @@
       <w14:ligatures w14:val="none"/>
     </w:rPr>
   </w:style>
+  <w:style w:type="character" w:styleId="Hyperlink">
+    <w:name w:val="Hyperlink"/>
+    <w:basedOn w:val="DefaultParagraphFont"/>
+    <w:uiPriority w:val="99"/>
+    <w:unhideWhenUsed/>
+    <w:rsid w:val="00A65A9D"/>
+    <w:rPr>
+      <w:color w:val="467886" w:themeColor="hyperlink"/>
+      <w:u w:val="single"/>
+    </w:rPr>
+  </w:style>
+  <w:style w:type="character" w:styleId="UnresolvedMention">
+    <w:name w:val="Unresolved Mention"/>
+    <w:basedOn w:val="DefaultParagraphFont"/>
+    <w:uiPriority w:val="99"/>
+    <w:semiHidden/>
+    <w:unhideWhenUsed/>
+    <w:rsid w:val="00A65A9D"/>
+    <w:rPr>
+      <w:color w:val="605E5C"/>
+      <w:shd w:val="clear" w:color="auto" w:fill="E1DFDD"/>
+    </w:rPr>
+  </w:style>
 </w:styles>
 </file>
 

</xml_diff>